<commit_message>
docs: integracao de diagramas Mermaid no Markdown e ilustracoes institucionais ABNT no Word (.docx)
</commit_message>
<xml_diff>
--- a/producao/docs/docx/especificacao-modulos-dados-seinuc.docx
+++ b/producao/docs/docx/especificacao-modulos-dados-seinuc.docx
@@ -91,64 +91,77 @@
         <w:t>O presente documento estabelece o Dicionário de Dados, a estrutura de atributos espaciais, as regras de validação e os esquemas de integração (JSON Schema) para os quatro eixos temáticos que compõem o banco de dados oficial do SEINUC/PA.</w:t>
       </w:r>
     </w:p>
-    <w:tbl>
-      <w:tblPr>
-        <w:tblW w:type="auto" w:w="0"/>
-        <w:jc w:val="center"/>
-        <w:tblLook w:firstColumn="1" w:firstRow="1" w:lastColumn="0" w:lastRow="0" w:noHBand="0" w:noVBand="1" w:val="04A0"/>
-        <w:tblBorders>
-          <w:top w:val="single" w:sz="4" w:space="0" w:color="CCCCCC"/>
-          <w:bottom w:val="single" w:sz="4" w:space="0" w:color="CCCCCC"/>
-          <w:left w:val="single" w:sz="12" w:space="0" w:color="003366"/>
-          <w:right w:val="single" w:sz="4" w:space="0" w:color="CCCCCC"/>
-          <w:insideH w:val="none"/>
-          <w:insideV w:val="none"/>
-        </w:tblBorders>
-      </w:tblPr>
-      <w:tblGrid>
-        <w:gridCol w:w="9405"/>
-      </w:tblGrid>
-      <w:tr>
-        <w:tc>
-          <w:tcPr>
-            <w:tcW w:type="dxa" w:w="9405"/>
-            <w:shd w:fill="F4F6F8"/>
-            <w:tcMar>
-              <w:top w:w="120" w:type="dxa"/>
-              <w:bottom w:w="120" w:type="dxa"/>
-              <w:left w:w="180" w:type="dxa"/>
-              <w:right w:w="180" w:type="dxa"/>
-            </w:tcMar>
-          </w:tcPr>
-          <w:p>
-            <w:pPr>
-              <w:spacing w:line="240" w:lineRule="auto" w:before="80" w:after="80"/>
-              <w:ind w:firstLine="0"/>
-            </w:pPr>
-            <w:r>
-              <w:rPr>
-                <w:rFonts w:ascii="Consolas" w:hAnsi="Consolas"/>
-                <w:color w:val="1E1E1E"/>
-                <w:sz w:val="19"/>
-              </w:rPr>
-              <w:t>SEINUC/PA - ARQUITETURA CANÔNICA DE MÓDULOS DE DADOS</w:t>
-              <w:br/>
-              <w:t>├── MÓDULO I: Caracterização Ambiental, Biodiversidade e Clima (Quadro I)</w:t>
-              <w:br/>
-              <w:t>├── MÓDULO II: Geotecnologias, Delimitação e Zonas de Amortecimento (Quadro II)</w:t>
-              <w:br/>
-              <w:t>├── MÓDULO III: Gestão, Governança, Aspectos Antropológicos e UCs Legadas (Quadro III)</w:t>
-              <w:br/>
-              <w:t>└── MÓDULO IV: Caracterização Fundiária, Dominial e RPPNs (Quadro IV)</w:t>
-            </w:r>
-          </w:p>
-        </w:tc>
-      </w:tr>
-    </w:tbl>
     <w:p>
       <w:pPr>
-        <w:spacing w:after="120" w:line="240" w:lineRule="auto"/>
+        <w:spacing w:before="240" w:after="80"/>
+        <w:ind w:firstLine="0"/>
+        <w:jc w:val="center"/>
       </w:pPr>
+      <w:r>
+        <w:rPr>
+          <w:rFonts w:ascii="Times New Roman" w:hAnsi="Times New Roman"/>
+          <w:b/>
+          <w:sz w:val="20"/>
+        </w:rPr>
+        <w:t>Figura 1: Arquitetura Canônica dos Módulos de Dados do SEINUC/PA</w:t>
+      </w:r>
+    </w:p>
+    <w:p>
+      <w:pPr>
+        <w:spacing w:before="40" w:after="80"/>
+        <w:ind w:firstLine="0"/>
+        <w:jc w:val="center"/>
+      </w:pPr>
+      <w:r>
+        <w:drawing>
+          <wp:inline xmlns:a="http://schemas.openxmlformats.org/drawingml/2006/main" xmlns:pic="http://schemas.openxmlformats.org/drawingml/2006/picture">
+            <wp:extent cx="5669280" cy="2267712"/>
+            <wp:docPr id="1" name="Picture 1"/>
+            <wp:cNvGraphicFramePr>
+              <a:graphicFrameLocks noChangeAspect="1"/>
+            </wp:cNvGraphicFramePr>
+            <a:graphic>
+              <a:graphicData uri="http://schemas.openxmlformats.org/drawingml/2006/picture">
+                <pic:pic>
+                  <pic:nvPicPr>
+                    <pic:cNvPr id="0" name="diagrama_arquitetura_modulos.png"/>
+                    <pic:cNvPicPr/>
+                  </pic:nvPicPr>
+                  <pic:blipFill>
+                    <a:blip r:embed="rId11"/>
+                    <a:stretch>
+                      <a:fillRect/>
+                    </a:stretch>
+                  </pic:blipFill>
+                  <pic:spPr>
+                    <a:xfrm>
+                      <a:off x="0" y="0"/>
+                      <a:ext cx="5669280" cy="2267712"/>
+                    </a:xfrm>
+                    <a:prstGeom prst="rect"/>
+                  </pic:spPr>
+                </pic:pic>
+              </a:graphicData>
+            </a:graphic>
+          </wp:inline>
+        </w:drawing>
+      </w:r>
+    </w:p>
+    <w:p>
+      <w:pPr>
+        <w:spacing w:before="40" w:after="240"/>
+        <w:ind w:firstLine="0"/>
+        <w:jc w:val="center"/>
+      </w:pPr>
+      <w:r>
+        <w:rPr>
+          <w:rFonts w:ascii="Times New Roman" w:hAnsi="Times New Roman"/>
+          <w:i/>
+          <w:color w:val="646464"/>
+          <w:sz w:val="19"/>
+        </w:rPr>
+        <w:t>Fonte: Elaboração própria / SEINUC/PA (2026).</w:t>
+      </w:r>
     </w:p>
     <w:p>
       <w:pPr>

</xml_diff>

<commit_message>
docs: amplia modelo de dados (camada de zoneamento e Módulo III gestor/conselho/finanças) e adiciona Módulo D - Ficha da Unidade no portal
- Módulo II: campo zoneamento_disponivel e atributos da camada de zoneamento (id, zona, area, sigla, unidade)
- Módulo III: gestor responsavel, composicao do conselho, historico do plano, projetos, cooperacoes, concessoes e financas/CCA
- Portal: Módulo D (Ficha da Unidade), zoneamento condicionado ao Plano de Gestao e camadas federais de referencia (ICMBio/INDE)
- Regenera os .docx ABNT correspondentes
</commit_message>
<xml_diff>
--- a/producao/docs/docx/especificacao-modulos-dados-seinuc.docx
+++ b/producao/docs/docx/especificacao-modulos-dados-seinuc.docx
@@ -5663,6 +5663,185 @@
                 <w:color w:val="003366"/>
                 <w:sz w:val="20"/>
               </w:rPr>
+              <w:t>zoneamento_disponivel</w:t>
+            </w:r>
+          </w:p>
+        </w:tc>
+        <w:tc>
+          <w:tcPr>
+            <w:tcW w:type="dxa" w:w="1567"/>
+            <w:tcMar>
+              <w:top w:w="100" w:type="dxa"/>
+              <w:bottom w:w="100" w:type="dxa"/>
+              <w:left w:w="120" w:type="dxa"/>
+              <w:right w:w="120" w:type="dxa"/>
+            </w:tcMar>
+          </w:tcPr>
+          <w:p>
+            <w:pPr>
+              <w:spacing w:line="240" w:lineRule="auto" w:before="40" w:after="40"/>
+              <w:ind w:firstLine="0"/>
+              <w:jc w:val="left"/>
+            </w:pPr>
+            <w:r>
+              <w:rPr>
+                <w:rFonts w:ascii="Times New Roman" w:hAnsi="Times New Roman"/>
+                <w:b w:val="0"/>
+                <w:i w:val="0"/>
+                <w:sz w:val="20"/>
+              </w:rPr>
+              <w:t>C</w:t>
+            </w:r>
+          </w:p>
+        </w:tc>
+        <w:tc>
+          <w:tcPr>
+            <w:tcW w:type="dxa" w:w="1567"/>
+            <w:tcMar>
+              <w:top w:w="100" w:type="dxa"/>
+              <w:bottom w:w="100" w:type="dxa"/>
+              <w:left w:w="120" w:type="dxa"/>
+              <w:right w:w="120" w:type="dxa"/>
+            </w:tcMar>
+          </w:tcPr>
+          <w:p>
+            <w:pPr>
+              <w:spacing w:line="240" w:lineRule="auto" w:before="40" w:after="40"/>
+              <w:ind w:firstLine="0"/>
+              <w:jc w:val="left"/>
+            </w:pPr>
+            <w:r>
+              <w:rPr>
+                <w:rFonts w:ascii="Times New Roman" w:hAnsi="Times New Roman"/>
+                <w:b w:val="0"/>
+                <w:i w:val="0"/>
+                <w:sz w:val="20"/>
+              </w:rPr>
+              <w:t>3</w:t>
+            </w:r>
+          </w:p>
+        </w:tc>
+        <w:tc>
+          <w:tcPr>
+            <w:tcW w:type="dxa" w:w="1567"/>
+            <w:tcMar>
+              <w:top w:w="100" w:type="dxa"/>
+              <w:bottom w:w="100" w:type="dxa"/>
+              <w:left w:w="120" w:type="dxa"/>
+              <w:right w:w="120" w:type="dxa"/>
+            </w:tcMar>
+          </w:tcPr>
+          <w:p>
+            <w:pPr>
+              <w:spacing w:line="240" w:lineRule="auto" w:before="40" w:after="40"/>
+              <w:ind w:firstLine="0"/>
+              <w:jc w:val="left"/>
+            </w:pPr>
+            <w:r>
+              <w:rPr>
+                <w:rFonts w:ascii="Times New Roman" w:hAnsi="Times New Roman"/>
+                <w:b w:val="0"/>
+                <w:i w:val="0"/>
+                <w:sz w:val="20"/>
+              </w:rPr>
+              <w:t>0</w:t>
+            </w:r>
+          </w:p>
+        </w:tc>
+        <w:tc>
+          <w:tcPr>
+            <w:tcW w:type="dxa" w:w="1567"/>
+            <w:tcMar>
+              <w:top w:w="100" w:type="dxa"/>
+              <w:bottom w:w="100" w:type="dxa"/>
+              <w:left w:w="120" w:type="dxa"/>
+              <w:right w:w="120" w:type="dxa"/>
+            </w:tcMar>
+          </w:tcPr>
+          <w:p>
+            <w:pPr>
+              <w:spacing w:line="240" w:lineRule="auto" w:before="40" w:after="40"/>
+              <w:ind w:firstLine="0"/>
+              <w:jc w:val="left"/>
+            </w:pPr>
+            <w:r>
+              <w:rPr>
+                <w:rFonts w:ascii="Times New Roman" w:hAnsi="Times New Roman"/>
+                <w:b w:val="0"/>
+                <w:i w:val="0"/>
+                <w:sz w:val="20"/>
+              </w:rPr>
+              <w:t>Possui camada de zoneamento interno (depende da existência de Plano de Gestão aprovado)</w:t>
+            </w:r>
+          </w:p>
+        </w:tc>
+        <w:tc>
+          <w:tcPr>
+            <w:tcW w:type="dxa" w:w="1567"/>
+            <w:tcMar>
+              <w:top w:w="100" w:type="dxa"/>
+              <w:bottom w:w="100" w:type="dxa"/>
+              <w:left w:w="120" w:type="dxa"/>
+              <w:right w:w="120" w:type="dxa"/>
+            </w:tcMar>
+          </w:tcPr>
+          <w:p>
+            <w:pPr>
+              <w:spacing w:line="240" w:lineRule="auto" w:before="40" w:after="40"/>
+              <w:ind w:firstLine="0"/>
+              <w:jc w:val="left"/>
+            </w:pPr>
+            <w:r>
+              <w:rPr>
+                <w:rFonts w:ascii="Consolas" w:hAnsi="Consolas"/>
+                <w:color w:val="003366"/>
+                <w:sz w:val="20"/>
+              </w:rPr>
+              <w:t>SIM</w:t>
+            </w:r>
+            <w:r>
+              <w:rPr>
+                <w:rFonts w:ascii="Times New Roman" w:hAnsi="Times New Roman"/>
+                <w:b w:val="0"/>
+                <w:i w:val="0"/>
+                <w:sz w:val="20"/>
+              </w:rPr>
+              <w:t xml:space="preserve"> ou </w:t>
+            </w:r>
+            <w:r>
+              <w:rPr>
+                <w:rFonts w:ascii="Consolas" w:hAnsi="Consolas"/>
+                <w:color w:val="003366"/>
+                <w:sz w:val="20"/>
+              </w:rPr>
+              <w:t>NAO</w:t>
+            </w:r>
+          </w:p>
+        </w:tc>
+      </w:tr>
+      <w:tr>
+        <w:tc>
+          <w:tcPr>
+            <w:tcW w:type="dxa" w:w="1567"/>
+            <w:tcMar>
+              <w:top w:w="100" w:type="dxa"/>
+              <w:bottom w:w="100" w:type="dxa"/>
+              <w:left w:w="120" w:type="dxa"/>
+              <w:right w:w="120" w:type="dxa"/>
+            </w:tcMar>
+          </w:tcPr>
+          <w:p>
+            <w:pPr>
+              <w:spacing w:line="240" w:lineRule="auto" w:before="40" w:after="40"/>
+              <w:ind w:firstLine="0"/>
+              <w:jc w:val="left"/>
+            </w:pPr>
+            <w:r>
+              <w:rPr>
+                <w:rFonts w:ascii="Consolas" w:hAnsi="Consolas"/>
+                <w:color w:val="003366"/>
+                <w:sz w:val="20"/>
+              </w:rPr>
               <w:t>obs</w:t>
             </w:r>
           </w:p>
@@ -5821,7 +6000,1315 @@
           <w:i/>
           <w:sz w:val="24"/>
         </w:rPr>
-        <w:t>3.2. Esquema JSON de Validação (Módulo II)</w:t>
+        <w:t>3.2. Camada de Zoneamento Interno (Atributos da Camada Geoespacial)</w:t>
+      </w:r>
+    </w:p>
+    <w:p>
+      <w:pPr>
+        <w:spacing w:line="360" w:lineRule="auto" w:before="0" w:after="0"/>
+        <w:ind w:firstLine="709"/>
+        <w:jc w:val="both"/>
+      </w:pPr>
+      <w:r>
+        <w:rPr>
+          <w:rFonts w:ascii="Times New Roman" w:hAnsi="Times New Roman"/>
+          <w:b w:val="0"/>
+          <w:i w:val="0"/>
+          <w:sz w:val="24"/>
+        </w:rPr>
+        <w:t xml:space="preserve">O </w:t>
+      </w:r>
+      <w:r>
+        <w:rPr>
+          <w:rFonts w:ascii="Times New Roman" w:hAnsi="Times New Roman"/>
+          <w:b/>
+          <w:i w:val="0"/>
+          <w:sz w:val="24"/>
+        </w:rPr>
+        <w:t>zoneamento interno</w:t>
+      </w:r>
+      <w:r>
+        <w:rPr>
+          <w:rFonts w:ascii="Times New Roman" w:hAnsi="Times New Roman"/>
+          <w:b w:val="0"/>
+          <w:i w:val="0"/>
+          <w:sz w:val="24"/>
+        </w:rPr>
+        <w:t xml:space="preserve"> é uma </w:t>
+      </w:r>
+      <w:r>
+        <w:rPr>
+          <w:rFonts w:ascii="Times New Roman" w:hAnsi="Times New Roman"/>
+          <w:b/>
+          <w:i w:val="0"/>
+          <w:sz w:val="24"/>
+        </w:rPr>
+        <w:t>camada geográfica própria</w:t>
+      </w:r>
+      <w:r>
+        <w:rPr>
+          <w:rFonts w:ascii="Times New Roman" w:hAnsi="Times New Roman"/>
+          <w:b w:val="0"/>
+          <w:i w:val="0"/>
+          <w:sz w:val="24"/>
+        </w:rPr>
+        <w:t xml:space="preserve"> (polígonos das zonas da UC), integrante do pacote vetorial do Módulo II, no mesmo Datum </w:t>
+      </w:r>
+      <w:r>
+        <w:rPr>
+          <w:rFonts w:ascii="Times New Roman" w:hAnsi="Times New Roman"/>
+          <w:b/>
+          <w:i w:val="0"/>
+          <w:sz w:val="24"/>
+        </w:rPr>
+        <w:t>SIRGAS 2000 (EPSG:4674)</w:t>
+      </w:r>
+      <w:r>
+        <w:rPr>
+          <w:rFonts w:ascii="Times New Roman" w:hAnsi="Times New Roman"/>
+          <w:b w:val="0"/>
+          <w:i w:val="0"/>
+          <w:sz w:val="24"/>
+        </w:rPr>
+        <w:t xml:space="preserve">. A camada de zoneamento </w:t>
+      </w:r>
+      <w:r>
+        <w:rPr>
+          <w:rFonts w:ascii="Times New Roman" w:hAnsi="Times New Roman"/>
+          <w:b/>
+          <w:i w:val="0"/>
+          <w:sz w:val="24"/>
+        </w:rPr>
+        <w:t>somente existe quando a UC possui Plano de Gestão aprovado</w:t>
+      </w:r>
+      <w:r>
+        <w:rPr>
+          <w:rFonts w:ascii="Times New Roman" w:hAnsi="Times New Roman"/>
+          <w:b w:val="0"/>
+          <w:i w:val="0"/>
+          <w:sz w:val="24"/>
+        </w:rPr>
+        <w:t xml:space="preserve"> (</w:t>
+      </w:r>
+      <w:r>
+        <w:rPr>
+          <w:rFonts w:ascii="Consolas" w:hAnsi="Consolas"/>
+          <w:color w:val="003366"/>
+          <w:sz w:val="20"/>
+        </w:rPr>
+        <w:t>zoneamento_disponivel = SIM</w:t>
+      </w:r>
+      <w:r>
+        <w:rPr>
+          <w:rFonts w:ascii="Times New Roman" w:hAnsi="Times New Roman"/>
+          <w:b w:val="0"/>
+          <w:i w:val="0"/>
+          <w:sz w:val="24"/>
+        </w:rPr>
+        <w:t xml:space="preserve">, derivado de </w:t>
+      </w:r>
+      <w:r>
+        <w:rPr>
+          <w:rFonts w:ascii="Consolas" w:hAnsi="Consolas"/>
+          <w:color w:val="003366"/>
+          <w:sz w:val="20"/>
+        </w:rPr>
+        <w:t>plano_gestao_status = "Aprovado e Vigente"</w:t>
+      </w:r>
+      <w:r>
+        <w:rPr>
+          <w:rFonts w:ascii="Times New Roman" w:hAnsi="Times New Roman"/>
+          <w:b w:val="0"/>
+          <w:i w:val="0"/>
+          <w:sz w:val="24"/>
+        </w:rPr>
+        <w:t xml:space="preserve"> no Módulo III); UCs sem plano de gestão transmitem apenas as camadas de perímetro e Zona de Amortecimento.</w:t>
+      </w:r>
+    </w:p>
+    <w:tbl>
+      <w:tblPr>
+        <w:tblW w:type="auto" w:w="0"/>
+        <w:jc w:val="center"/>
+        <w:tblLook w:firstColumn="1" w:firstRow="1" w:lastColumn="0" w:lastRow="0" w:noHBand="0" w:noVBand="1" w:val="04A0"/>
+        <w:tblBorders>
+          <w:top w:val="single" w:sz="6" w:space="0" w:color="000000"/>
+          <w:bottom w:val="single" w:sz="6" w:space="0" w:color="000000"/>
+          <w:insideH w:val="single" w:sz="4" w:space="0" w:color="E0E0E0"/>
+          <w:left w:val="none"/>
+          <w:right w:val="none"/>
+          <w:insideV w:val="none"/>
+        </w:tblBorders>
+      </w:tblPr>
+      <w:tblGrid>
+        <w:gridCol w:w="1567"/>
+        <w:gridCol w:w="1567"/>
+        <w:gridCol w:w="1567"/>
+        <w:gridCol w:w="1567"/>
+        <w:gridCol w:w="1567"/>
+        <w:gridCol w:w="1567"/>
+      </w:tblGrid>
+      <w:tr>
+        <w:tc>
+          <w:tcPr>
+            <w:tcW w:type="dxa" w:w="1567"/>
+            <w:tcMar>
+              <w:top w:w="100" w:type="dxa"/>
+              <w:bottom w:w="100" w:type="dxa"/>
+              <w:left w:w="120" w:type="dxa"/>
+              <w:right w:w="120" w:type="dxa"/>
+            </w:tcMar>
+            <w:shd w:fill="F2F2F2"/>
+          </w:tcPr>
+          <w:p>
+            <w:pPr>
+              <w:spacing w:line="240" w:lineRule="auto" w:before="40" w:after="40"/>
+              <w:ind w:firstLine="0"/>
+              <w:jc w:val="center"/>
+            </w:pPr>
+            <w:r>
+              <w:rPr>
+                <w:rFonts w:ascii="Times New Roman" w:hAnsi="Times New Roman"/>
+                <w:b/>
+                <w:i w:val="0"/>
+                <w:sz w:val="20"/>
+              </w:rPr>
+              <w:t>Nome da Coluna (Shapefile DBF)</w:t>
+            </w:r>
+          </w:p>
+        </w:tc>
+        <w:tc>
+          <w:tcPr>
+            <w:tcW w:type="dxa" w:w="1567"/>
+            <w:tcMar>
+              <w:top w:w="100" w:type="dxa"/>
+              <w:bottom w:w="100" w:type="dxa"/>
+              <w:left w:w="120" w:type="dxa"/>
+              <w:right w:w="120" w:type="dxa"/>
+            </w:tcMar>
+            <w:shd w:fill="F2F2F2"/>
+          </w:tcPr>
+          <w:p>
+            <w:pPr>
+              <w:spacing w:line="240" w:lineRule="auto" w:before="40" w:after="40"/>
+              <w:ind w:firstLine="0"/>
+              <w:jc w:val="center"/>
+            </w:pPr>
+            <w:r>
+              <w:rPr>
+                <w:rFonts w:ascii="Times New Roman" w:hAnsi="Times New Roman"/>
+                <w:b/>
+                <w:i w:val="0"/>
+                <w:sz w:val="20"/>
+              </w:rPr>
+              <w:t>Tipo</w:t>
+            </w:r>
+          </w:p>
+        </w:tc>
+        <w:tc>
+          <w:tcPr>
+            <w:tcW w:type="dxa" w:w="1567"/>
+            <w:tcMar>
+              <w:top w:w="100" w:type="dxa"/>
+              <w:bottom w:w="100" w:type="dxa"/>
+              <w:left w:w="120" w:type="dxa"/>
+              <w:right w:w="120" w:type="dxa"/>
+            </w:tcMar>
+            <w:shd w:fill="F2F2F2"/>
+          </w:tcPr>
+          <w:p>
+            <w:pPr>
+              <w:spacing w:line="240" w:lineRule="auto" w:before="40" w:after="40"/>
+              <w:ind w:firstLine="0"/>
+              <w:jc w:val="center"/>
+            </w:pPr>
+            <w:r>
+              <w:rPr>
+                <w:rFonts w:ascii="Times New Roman" w:hAnsi="Times New Roman"/>
+                <w:b/>
+                <w:i w:val="0"/>
+                <w:sz w:val="20"/>
+              </w:rPr>
+              <w:t>Tamanho</w:t>
+            </w:r>
+          </w:p>
+        </w:tc>
+        <w:tc>
+          <w:tcPr>
+            <w:tcW w:type="dxa" w:w="1567"/>
+            <w:tcMar>
+              <w:top w:w="100" w:type="dxa"/>
+              <w:bottom w:w="100" w:type="dxa"/>
+              <w:left w:w="120" w:type="dxa"/>
+              <w:right w:w="120" w:type="dxa"/>
+            </w:tcMar>
+            <w:shd w:fill="F2F2F2"/>
+          </w:tcPr>
+          <w:p>
+            <w:pPr>
+              <w:spacing w:line="240" w:lineRule="auto" w:before="40" w:after="40"/>
+              <w:ind w:firstLine="0"/>
+              <w:jc w:val="center"/>
+            </w:pPr>
+            <w:r>
+              <w:rPr>
+                <w:rFonts w:ascii="Times New Roman" w:hAnsi="Times New Roman"/>
+                <w:b/>
+                <w:i w:val="0"/>
+                <w:sz w:val="20"/>
+              </w:rPr>
+              <w:t>Precisão</w:t>
+            </w:r>
+          </w:p>
+        </w:tc>
+        <w:tc>
+          <w:tcPr>
+            <w:tcW w:type="dxa" w:w="1567"/>
+            <w:tcMar>
+              <w:top w:w="100" w:type="dxa"/>
+              <w:bottom w:w="100" w:type="dxa"/>
+              <w:left w:w="120" w:type="dxa"/>
+              <w:right w:w="120" w:type="dxa"/>
+            </w:tcMar>
+            <w:shd w:fill="F2F2F2"/>
+          </w:tcPr>
+          <w:p>
+            <w:pPr>
+              <w:spacing w:line="240" w:lineRule="auto" w:before="40" w:after="40"/>
+              <w:ind w:firstLine="0"/>
+              <w:jc w:val="center"/>
+            </w:pPr>
+            <w:r>
+              <w:rPr>
+                <w:rFonts w:ascii="Times New Roman" w:hAnsi="Times New Roman"/>
+                <w:b/>
+                <w:i w:val="0"/>
+                <w:sz w:val="20"/>
+              </w:rPr>
+              <w:t>Descrição do Atributo</w:t>
+            </w:r>
+          </w:p>
+        </w:tc>
+        <w:tc>
+          <w:tcPr>
+            <w:tcW w:type="dxa" w:w="1567"/>
+            <w:tcMar>
+              <w:top w:w="100" w:type="dxa"/>
+              <w:bottom w:w="100" w:type="dxa"/>
+              <w:left w:w="120" w:type="dxa"/>
+              <w:right w:w="120" w:type="dxa"/>
+            </w:tcMar>
+            <w:shd w:fill="F2F2F2"/>
+          </w:tcPr>
+          <w:p>
+            <w:pPr>
+              <w:spacing w:line="240" w:lineRule="auto" w:before="40" w:after="40"/>
+              <w:ind w:firstLine="0"/>
+              <w:jc w:val="center"/>
+            </w:pPr>
+            <w:r>
+              <w:rPr>
+                <w:rFonts w:ascii="Times New Roman" w:hAnsi="Times New Roman"/>
+                <w:b/>
+                <w:i w:val="0"/>
+                <w:sz w:val="20"/>
+              </w:rPr>
+              <w:t>Exemplo Real</w:t>
+            </w:r>
+          </w:p>
+        </w:tc>
+      </w:tr>
+      <w:tr>
+        <w:tc>
+          <w:tcPr>
+            <w:tcW w:type="dxa" w:w="1567"/>
+            <w:tcMar>
+              <w:top w:w="100" w:type="dxa"/>
+              <w:bottom w:w="100" w:type="dxa"/>
+              <w:left w:w="120" w:type="dxa"/>
+              <w:right w:w="120" w:type="dxa"/>
+            </w:tcMar>
+          </w:tcPr>
+          <w:p>
+            <w:pPr>
+              <w:spacing w:line="240" w:lineRule="auto" w:before="40" w:after="40"/>
+              <w:ind w:firstLine="0"/>
+              <w:jc w:val="left"/>
+            </w:pPr>
+            <w:r>
+              <w:rPr>
+                <w:rFonts w:ascii="Consolas" w:hAnsi="Consolas"/>
+                <w:color w:val="003366"/>
+                <w:sz w:val="20"/>
+              </w:rPr>
+              <w:t>id</w:t>
+            </w:r>
+          </w:p>
+        </w:tc>
+        <w:tc>
+          <w:tcPr>
+            <w:tcW w:type="dxa" w:w="1567"/>
+            <w:tcMar>
+              <w:top w:w="100" w:type="dxa"/>
+              <w:bottom w:w="100" w:type="dxa"/>
+              <w:left w:w="120" w:type="dxa"/>
+              <w:right w:w="120" w:type="dxa"/>
+            </w:tcMar>
+          </w:tcPr>
+          <w:p>
+            <w:pPr>
+              <w:spacing w:line="240" w:lineRule="auto" w:before="40" w:after="40"/>
+              <w:ind w:firstLine="0"/>
+              <w:jc w:val="left"/>
+            </w:pPr>
+            <w:r>
+              <w:rPr>
+                <w:rFonts w:ascii="Times New Roman" w:hAnsi="Times New Roman"/>
+                <w:b w:val="0"/>
+                <w:i w:val="0"/>
+                <w:sz w:val="20"/>
+              </w:rPr>
+              <w:t>N</w:t>
+            </w:r>
+          </w:p>
+        </w:tc>
+        <w:tc>
+          <w:tcPr>
+            <w:tcW w:type="dxa" w:w="1567"/>
+            <w:tcMar>
+              <w:top w:w="100" w:type="dxa"/>
+              <w:bottom w:w="100" w:type="dxa"/>
+              <w:left w:w="120" w:type="dxa"/>
+              <w:right w:w="120" w:type="dxa"/>
+            </w:tcMar>
+          </w:tcPr>
+          <w:p>
+            <w:pPr>
+              <w:spacing w:line="240" w:lineRule="auto" w:before="40" w:after="40"/>
+              <w:ind w:firstLine="0"/>
+              <w:jc w:val="left"/>
+            </w:pPr>
+            <w:r>
+              <w:rPr>
+                <w:rFonts w:ascii="Times New Roman" w:hAnsi="Times New Roman"/>
+                <w:b w:val="0"/>
+                <w:i w:val="0"/>
+                <w:sz w:val="20"/>
+              </w:rPr>
+              <w:t>10</w:t>
+            </w:r>
+          </w:p>
+        </w:tc>
+        <w:tc>
+          <w:tcPr>
+            <w:tcW w:type="dxa" w:w="1567"/>
+            <w:tcMar>
+              <w:top w:w="100" w:type="dxa"/>
+              <w:bottom w:w="100" w:type="dxa"/>
+              <w:left w:w="120" w:type="dxa"/>
+              <w:right w:w="120" w:type="dxa"/>
+            </w:tcMar>
+          </w:tcPr>
+          <w:p>
+            <w:pPr>
+              <w:spacing w:line="240" w:lineRule="auto" w:before="40" w:after="40"/>
+              <w:ind w:firstLine="0"/>
+              <w:jc w:val="left"/>
+            </w:pPr>
+            <w:r>
+              <w:rPr>
+                <w:rFonts w:ascii="Times New Roman" w:hAnsi="Times New Roman"/>
+                <w:b w:val="0"/>
+                <w:i w:val="0"/>
+                <w:sz w:val="20"/>
+              </w:rPr>
+              <w:t>0</w:t>
+            </w:r>
+          </w:p>
+        </w:tc>
+        <w:tc>
+          <w:tcPr>
+            <w:tcW w:type="dxa" w:w="1567"/>
+            <w:tcMar>
+              <w:top w:w="100" w:type="dxa"/>
+              <w:bottom w:w="100" w:type="dxa"/>
+              <w:left w:w="120" w:type="dxa"/>
+              <w:right w:w="120" w:type="dxa"/>
+            </w:tcMar>
+          </w:tcPr>
+          <w:p>
+            <w:pPr>
+              <w:spacing w:line="240" w:lineRule="auto" w:before="40" w:after="40"/>
+              <w:ind w:firstLine="0"/>
+              <w:jc w:val="left"/>
+            </w:pPr>
+            <w:r>
+              <w:rPr>
+                <w:rFonts w:ascii="Times New Roman" w:hAnsi="Times New Roman"/>
+                <w:b w:val="0"/>
+                <w:i w:val="0"/>
+                <w:sz w:val="20"/>
+              </w:rPr>
+              <w:t>Identificador numérico da zona (chave da feição)</w:t>
+            </w:r>
+          </w:p>
+        </w:tc>
+        <w:tc>
+          <w:tcPr>
+            <w:tcW w:type="dxa" w:w="1567"/>
+            <w:tcMar>
+              <w:top w:w="100" w:type="dxa"/>
+              <w:bottom w:w="100" w:type="dxa"/>
+              <w:left w:w="120" w:type="dxa"/>
+              <w:right w:w="120" w:type="dxa"/>
+            </w:tcMar>
+          </w:tcPr>
+          <w:p>
+            <w:pPr>
+              <w:spacing w:line="240" w:lineRule="auto" w:before="40" w:after="40"/>
+              <w:ind w:firstLine="0"/>
+              <w:jc w:val="left"/>
+            </w:pPr>
+            <w:r>
+              <w:rPr>
+                <w:rFonts w:ascii="Consolas" w:hAnsi="Consolas"/>
+                <w:color w:val="003366"/>
+                <w:sz w:val="20"/>
+              </w:rPr>
+              <w:t>1</w:t>
+            </w:r>
+            <w:r>
+              <w:rPr>
+                <w:rFonts w:ascii="Times New Roman" w:hAnsi="Times New Roman"/>
+                <w:b w:val="0"/>
+                <w:i w:val="0"/>
+                <w:sz w:val="20"/>
+              </w:rPr>
+              <w:t xml:space="preserve">, </w:t>
+            </w:r>
+            <w:r>
+              <w:rPr>
+                <w:rFonts w:ascii="Consolas" w:hAnsi="Consolas"/>
+                <w:color w:val="003366"/>
+                <w:sz w:val="20"/>
+              </w:rPr>
+              <w:t>2</w:t>
+            </w:r>
+          </w:p>
+        </w:tc>
+      </w:tr>
+      <w:tr>
+        <w:tc>
+          <w:tcPr>
+            <w:tcW w:type="dxa" w:w="1567"/>
+            <w:tcMar>
+              <w:top w:w="100" w:type="dxa"/>
+              <w:bottom w:w="100" w:type="dxa"/>
+              <w:left w:w="120" w:type="dxa"/>
+              <w:right w:w="120" w:type="dxa"/>
+            </w:tcMar>
+          </w:tcPr>
+          <w:p>
+            <w:pPr>
+              <w:spacing w:line="240" w:lineRule="auto" w:before="40" w:after="40"/>
+              <w:ind w:firstLine="0"/>
+              <w:jc w:val="left"/>
+            </w:pPr>
+            <w:r>
+              <w:rPr>
+                <w:rFonts w:ascii="Consolas" w:hAnsi="Consolas"/>
+                <w:color w:val="003366"/>
+                <w:sz w:val="20"/>
+              </w:rPr>
+              <w:t>zona</w:t>
+            </w:r>
+          </w:p>
+        </w:tc>
+        <w:tc>
+          <w:tcPr>
+            <w:tcW w:type="dxa" w:w="1567"/>
+            <w:tcMar>
+              <w:top w:w="100" w:type="dxa"/>
+              <w:bottom w:w="100" w:type="dxa"/>
+              <w:left w:w="120" w:type="dxa"/>
+              <w:right w:w="120" w:type="dxa"/>
+            </w:tcMar>
+          </w:tcPr>
+          <w:p>
+            <w:pPr>
+              <w:spacing w:line="240" w:lineRule="auto" w:before="40" w:after="40"/>
+              <w:ind w:firstLine="0"/>
+              <w:jc w:val="left"/>
+            </w:pPr>
+            <w:r>
+              <w:rPr>
+                <w:rFonts w:ascii="Times New Roman" w:hAnsi="Times New Roman"/>
+                <w:b w:val="0"/>
+                <w:i w:val="0"/>
+                <w:sz w:val="20"/>
+              </w:rPr>
+              <w:t>C</w:t>
+            </w:r>
+          </w:p>
+        </w:tc>
+        <w:tc>
+          <w:tcPr>
+            <w:tcW w:type="dxa" w:w="1567"/>
+            <w:tcMar>
+              <w:top w:w="100" w:type="dxa"/>
+              <w:bottom w:w="100" w:type="dxa"/>
+              <w:left w:w="120" w:type="dxa"/>
+              <w:right w:w="120" w:type="dxa"/>
+            </w:tcMar>
+          </w:tcPr>
+          <w:p>
+            <w:pPr>
+              <w:spacing w:line="240" w:lineRule="auto" w:before="40" w:after="40"/>
+              <w:ind w:firstLine="0"/>
+              <w:jc w:val="left"/>
+            </w:pPr>
+            <w:r>
+              <w:rPr>
+                <w:rFonts w:ascii="Times New Roman" w:hAnsi="Times New Roman"/>
+                <w:b w:val="0"/>
+                <w:i w:val="0"/>
+                <w:sz w:val="20"/>
+              </w:rPr>
+              <w:t>100</w:t>
+            </w:r>
+          </w:p>
+        </w:tc>
+        <w:tc>
+          <w:tcPr>
+            <w:tcW w:type="dxa" w:w="1567"/>
+            <w:tcMar>
+              <w:top w:w="100" w:type="dxa"/>
+              <w:bottom w:w="100" w:type="dxa"/>
+              <w:left w:w="120" w:type="dxa"/>
+              <w:right w:w="120" w:type="dxa"/>
+            </w:tcMar>
+          </w:tcPr>
+          <w:p>
+            <w:pPr>
+              <w:spacing w:line="240" w:lineRule="auto" w:before="40" w:after="40"/>
+              <w:ind w:firstLine="0"/>
+              <w:jc w:val="left"/>
+            </w:pPr>
+            <w:r>
+              <w:rPr>
+                <w:rFonts w:ascii="Times New Roman" w:hAnsi="Times New Roman"/>
+                <w:b w:val="0"/>
+                <w:i w:val="0"/>
+                <w:sz w:val="20"/>
+              </w:rPr>
+              <w:t>0</w:t>
+            </w:r>
+          </w:p>
+        </w:tc>
+        <w:tc>
+          <w:tcPr>
+            <w:tcW w:type="dxa" w:w="1567"/>
+            <w:tcMar>
+              <w:top w:w="100" w:type="dxa"/>
+              <w:bottom w:w="100" w:type="dxa"/>
+              <w:left w:w="120" w:type="dxa"/>
+              <w:right w:w="120" w:type="dxa"/>
+            </w:tcMar>
+          </w:tcPr>
+          <w:p>
+            <w:pPr>
+              <w:spacing w:line="240" w:lineRule="auto" w:before="40" w:after="40"/>
+              <w:ind w:firstLine="0"/>
+              <w:jc w:val="left"/>
+            </w:pPr>
+            <w:r>
+              <w:rPr>
+                <w:rFonts w:ascii="Times New Roman" w:hAnsi="Times New Roman"/>
+                <w:b w:val="0"/>
+                <w:i w:val="0"/>
+                <w:sz w:val="20"/>
+              </w:rPr>
+              <w:t>Nome da zona do Plano de Gestão</w:t>
+            </w:r>
+          </w:p>
+        </w:tc>
+        <w:tc>
+          <w:tcPr>
+            <w:tcW w:type="dxa" w:w="1567"/>
+            <w:tcMar>
+              <w:top w:w="100" w:type="dxa"/>
+              <w:bottom w:w="100" w:type="dxa"/>
+              <w:left w:w="120" w:type="dxa"/>
+              <w:right w:w="120" w:type="dxa"/>
+            </w:tcMar>
+          </w:tcPr>
+          <w:p>
+            <w:pPr>
+              <w:spacing w:line="240" w:lineRule="auto" w:before="40" w:after="40"/>
+              <w:ind w:firstLine="0"/>
+              <w:jc w:val="left"/>
+            </w:pPr>
+            <w:r>
+              <w:rPr>
+                <w:rFonts w:ascii="Consolas" w:hAnsi="Consolas"/>
+                <w:color w:val="003366"/>
+                <w:sz w:val="20"/>
+              </w:rPr>
+              <w:t>Zona Intangível</w:t>
+            </w:r>
+            <w:r>
+              <w:rPr>
+                <w:rFonts w:ascii="Times New Roman" w:hAnsi="Times New Roman"/>
+                <w:b w:val="0"/>
+                <w:i w:val="0"/>
+                <w:sz w:val="20"/>
+              </w:rPr>
+              <w:t xml:space="preserve">, </w:t>
+            </w:r>
+            <w:r>
+              <w:rPr>
+                <w:rFonts w:ascii="Consolas" w:hAnsi="Consolas"/>
+                <w:color w:val="003366"/>
+                <w:sz w:val="20"/>
+              </w:rPr>
+              <w:t>Zona Primitiva</w:t>
+            </w:r>
+          </w:p>
+        </w:tc>
+      </w:tr>
+      <w:tr>
+        <w:tc>
+          <w:tcPr>
+            <w:tcW w:type="dxa" w:w="1567"/>
+            <w:tcMar>
+              <w:top w:w="100" w:type="dxa"/>
+              <w:bottom w:w="100" w:type="dxa"/>
+              <w:left w:w="120" w:type="dxa"/>
+              <w:right w:w="120" w:type="dxa"/>
+            </w:tcMar>
+          </w:tcPr>
+          <w:p>
+            <w:pPr>
+              <w:spacing w:line="240" w:lineRule="auto" w:before="40" w:after="40"/>
+              <w:ind w:firstLine="0"/>
+              <w:jc w:val="left"/>
+            </w:pPr>
+            <w:r>
+              <w:rPr>
+                <w:rFonts w:ascii="Consolas" w:hAnsi="Consolas"/>
+                <w:color w:val="003366"/>
+                <w:sz w:val="20"/>
+              </w:rPr>
+              <w:t>area</w:t>
+            </w:r>
+          </w:p>
+        </w:tc>
+        <w:tc>
+          <w:tcPr>
+            <w:tcW w:type="dxa" w:w="1567"/>
+            <w:tcMar>
+              <w:top w:w="100" w:type="dxa"/>
+              <w:bottom w:w="100" w:type="dxa"/>
+              <w:left w:w="120" w:type="dxa"/>
+              <w:right w:w="120" w:type="dxa"/>
+            </w:tcMar>
+          </w:tcPr>
+          <w:p>
+            <w:pPr>
+              <w:spacing w:line="240" w:lineRule="auto" w:before="40" w:after="40"/>
+              <w:ind w:firstLine="0"/>
+              <w:jc w:val="left"/>
+            </w:pPr>
+            <w:r>
+              <w:rPr>
+                <w:rFonts w:ascii="Times New Roman" w:hAnsi="Times New Roman"/>
+                <w:b w:val="0"/>
+                <w:i w:val="0"/>
+                <w:sz w:val="20"/>
+              </w:rPr>
+              <w:t>N</w:t>
+            </w:r>
+          </w:p>
+        </w:tc>
+        <w:tc>
+          <w:tcPr>
+            <w:tcW w:type="dxa" w:w="1567"/>
+            <w:tcMar>
+              <w:top w:w="100" w:type="dxa"/>
+              <w:bottom w:w="100" w:type="dxa"/>
+              <w:left w:w="120" w:type="dxa"/>
+              <w:right w:w="120" w:type="dxa"/>
+            </w:tcMar>
+          </w:tcPr>
+          <w:p>
+            <w:pPr>
+              <w:spacing w:line="240" w:lineRule="auto" w:before="40" w:after="40"/>
+              <w:ind w:firstLine="0"/>
+              <w:jc w:val="left"/>
+            </w:pPr>
+            <w:r>
+              <w:rPr>
+                <w:rFonts w:ascii="Times New Roman" w:hAnsi="Times New Roman"/>
+                <w:b w:val="0"/>
+                <w:i w:val="0"/>
+                <w:sz w:val="20"/>
+              </w:rPr>
+              <w:t>24</w:t>
+            </w:r>
+          </w:p>
+        </w:tc>
+        <w:tc>
+          <w:tcPr>
+            <w:tcW w:type="dxa" w:w="1567"/>
+            <w:tcMar>
+              <w:top w:w="100" w:type="dxa"/>
+              <w:bottom w:w="100" w:type="dxa"/>
+              <w:left w:w="120" w:type="dxa"/>
+              <w:right w:w="120" w:type="dxa"/>
+            </w:tcMar>
+          </w:tcPr>
+          <w:p>
+            <w:pPr>
+              <w:spacing w:line="240" w:lineRule="auto" w:before="40" w:after="40"/>
+              <w:ind w:firstLine="0"/>
+              <w:jc w:val="left"/>
+            </w:pPr>
+            <w:r>
+              <w:rPr>
+                <w:rFonts w:ascii="Times New Roman" w:hAnsi="Times New Roman"/>
+                <w:b w:val="0"/>
+                <w:i w:val="0"/>
+                <w:sz w:val="20"/>
+              </w:rPr>
+              <w:t>2</w:t>
+            </w:r>
+          </w:p>
+        </w:tc>
+        <w:tc>
+          <w:tcPr>
+            <w:tcW w:type="dxa" w:w="1567"/>
+            <w:tcMar>
+              <w:top w:w="100" w:type="dxa"/>
+              <w:bottom w:w="100" w:type="dxa"/>
+              <w:left w:w="120" w:type="dxa"/>
+              <w:right w:w="120" w:type="dxa"/>
+            </w:tcMar>
+          </w:tcPr>
+          <w:p>
+            <w:pPr>
+              <w:spacing w:line="240" w:lineRule="auto" w:before="40" w:after="40"/>
+              <w:ind w:firstLine="0"/>
+              <w:jc w:val="left"/>
+            </w:pPr>
+            <w:r>
+              <w:rPr>
+                <w:rFonts w:ascii="Times New Roman" w:hAnsi="Times New Roman"/>
+                <w:b w:val="0"/>
+                <w:i w:val="0"/>
+                <w:sz w:val="20"/>
+              </w:rPr>
+              <w:t>Área da zona em hectares (calculada pelo GIS)</w:t>
+            </w:r>
+          </w:p>
+        </w:tc>
+        <w:tc>
+          <w:tcPr>
+            <w:tcW w:type="dxa" w:w="1567"/>
+            <w:tcMar>
+              <w:top w:w="100" w:type="dxa"/>
+              <w:bottom w:w="100" w:type="dxa"/>
+              <w:left w:w="120" w:type="dxa"/>
+              <w:right w:w="120" w:type="dxa"/>
+            </w:tcMar>
+          </w:tcPr>
+          <w:p>
+            <w:pPr>
+              <w:spacing w:line="240" w:lineRule="auto" w:before="40" w:after="40"/>
+              <w:ind w:firstLine="0"/>
+              <w:jc w:val="left"/>
+            </w:pPr>
+            <w:r>
+              <w:rPr>
+                <w:rFonts w:ascii="Consolas" w:hAnsi="Consolas"/>
+                <w:color w:val="003366"/>
+                <w:sz w:val="20"/>
+              </w:rPr>
+              <w:t>1234.56</w:t>
+            </w:r>
+          </w:p>
+        </w:tc>
+      </w:tr>
+      <w:tr>
+        <w:tc>
+          <w:tcPr>
+            <w:tcW w:type="dxa" w:w="1567"/>
+            <w:tcMar>
+              <w:top w:w="100" w:type="dxa"/>
+              <w:bottom w:w="100" w:type="dxa"/>
+              <w:left w:w="120" w:type="dxa"/>
+              <w:right w:w="120" w:type="dxa"/>
+            </w:tcMar>
+          </w:tcPr>
+          <w:p>
+            <w:pPr>
+              <w:spacing w:line="240" w:lineRule="auto" w:before="40" w:after="40"/>
+              <w:ind w:firstLine="0"/>
+              <w:jc w:val="left"/>
+            </w:pPr>
+            <w:r>
+              <w:rPr>
+                <w:rFonts w:ascii="Consolas" w:hAnsi="Consolas"/>
+                <w:color w:val="003366"/>
+                <w:sz w:val="20"/>
+              </w:rPr>
+              <w:t>sigla</w:t>
+            </w:r>
+          </w:p>
+        </w:tc>
+        <w:tc>
+          <w:tcPr>
+            <w:tcW w:type="dxa" w:w="1567"/>
+            <w:tcMar>
+              <w:top w:w="100" w:type="dxa"/>
+              <w:bottom w:w="100" w:type="dxa"/>
+              <w:left w:w="120" w:type="dxa"/>
+              <w:right w:w="120" w:type="dxa"/>
+            </w:tcMar>
+          </w:tcPr>
+          <w:p>
+            <w:pPr>
+              <w:spacing w:line="240" w:lineRule="auto" w:before="40" w:after="40"/>
+              <w:ind w:firstLine="0"/>
+              <w:jc w:val="left"/>
+            </w:pPr>
+            <w:r>
+              <w:rPr>
+                <w:rFonts w:ascii="Times New Roman" w:hAnsi="Times New Roman"/>
+                <w:b w:val="0"/>
+                <w:i w:val="0"/>
+                <w:sz w:val="20"/>
+              </w:rPr>
+              <w:t>C</w:t>
+            </w:r>
+          </w:p>
+        </w:tc>
+        <w:tc>
+          <w:tcPr>
+            <w:tcW w:type="dxa" w:w="1567"/>
+            <w:tcMar>
+              <w:top w:w="100" w:type="dxa"/>
+              <w:bottom w:w="100" w:type="dxa"/>
+              <w:left w:w="120" w:type="dxa"/>
+              <w:right w:w="120" w:type="dxa"/>
+            </w:tcMar>
+          </w:tcPr>
+          <w:p>
+            <w:pPr>
+              <w:spacing w:line="240" w:lineRule="auto" w:before="40" w:after="40"/>
+              <w:ind w:firstLine="0"/>
+              <w:jc w:val="left"/>
+            </w:pPr>
+            <w:r>
+              <w:rPr>
+                <w:rFonts w:ascii="Times New Roman" w:hAnsi="Times New Roman"/>
+                <w:b w:val="0"/>
+                <w:i w:val="0"/>
+                <w:sz w:val="20"/>
+              </w:rPr>
+              <w:t>20</w:t>
+            </w:r>
+          </w:p>
+        </w:tc>
+        <w:tc>
+          <w:tcPr>
+            <w:tcW w:type="dxa" w:w="1567"/>
+            <w:tcMar>
+              <w:top w:w="100" w:type="dxa"/>
+              <w:bottom w:w="100" w:type="dxa"/>
+              <w:left w:w="120" w:type="dxa"/>
+              <w:right w:w="120" w:type="dxa"/>
+            </w:tcMar>
+          </w:tcPr>
+          <w:p>
+            <w:pPr>
+              <w:spacing w:line="240" w:lineRule="auto" w:before="40" w:after="40"/>
+              <w:ind w:firstLine="0"/>
+              <w:jc w:val="left"/>
+            </w:pPr>
+            <w:r>
+              <w:rPr>
+                <w:rFonts w:ascii="Times New Roman" w:hAnsi="Times New Roman"/>
+                <w:b w:val="0"/>
+                <w:i w:val="0"/>
+                <w:sz w:val="20"/>
+              </w:rPr>
+              <w:t>0</w:t>
+            </w:r>
+          </w:p>
+        </w:tc>
+        <w:tc>
+          <w:tcPr>
+            <w:tcW w:type="dxa" w:w="1567"/>
+            <w:tcMar>
+              <w:top w:w="100" w:type="dxa"/>
+              <w:bottom w:w="100" w:type="dxa"/>
+              <w:left w:w="120" w:type="dxa"/>
+              <w:right w:w="120" w:type="dxa"/>
+            </w:tcMar>
+          </w:tcPr>
+          <w:p>
+            <w:pPr>
+              <w:spacing w:line="240" w:lineRule="auto" w:before="40" w:after="40"/>
+              <w:ind w:firstLine="0"/>
+              <w:jc w:val="left"/>
+            </w:pPr>
+            <w:r>
+              <w:rPr>
+                <w:rFonts w:ascii="Times New Roman" w:hAnsi="Times New Roman"/>
+                <w:b w:val="0"/>
+                <w:i w:val="0"/>
+                <w:sz w:val="20"/>
+              </w:rPr>
+              <w:t>Sigla da zona</w:t>
+            </w:r>
+          </w:p>
+        </w:tc>
+        <w:tc>
+          <w:tcPr>
+            <w:tcW w:type="dxa" w:w="1567"/>
+            <w:tcMar>
+              <w:top w:w="100" w:type="dxa"/>
+              <w:bottom w:w="100" w:type="dxa"/>
+              <w:left w:w="120" w:type="dxa"/>
+              <w:right w:w="120" w:type="dxa"/>
+            </w:tcMar>
+          </w:tcPr>
+          <w:p>
+            <w:pPr>
+              <w:spacing w:line="240" w:lineRule="auto" w:before="40" w:after="40"/>
+              <w:ind w:firstLine="0"/>
+              <w:jc w:val="left"/>
+            </w:pPr>
+            <w:r>
+              <w:rPr>
+                <w:rFonts w:ascii="Consolas" w:hAnsi="Consolas"/>
+                <w:color w:val="003366"/>
+                <w:sz w:val="20"/>
+              </w:rPr>
+              <w:t>ZI</w:t>
+            </w:r>
+            <w:r>
+              <w:rPr>
+                <w:rFonts w:ascii="Times New Roman" w:hAnsi="Times New Roman"/>
+                <w:b w:val="0"/>
+                <w:i w:val="0"/>
+                <w:sz w:val="20"/>
+              </w:rPr>
+              <w:t xml:space="preserve">, </w:t>
+            </w:r>
+            <w:r>
+              <w:rPr>
+                <w:rFonts w:ascii="Consolas" w:hAnsi="Consolas"/>
+                <w:color w:val="003366"/>
+                <w:sz w:val="20"/>
+              </w:rPr>
+              <w:t>ZP</w:t>
+            </w:r>
+            <w:r>
+              <w:rPr>
+                <w:rFonts w:ascii="Times New Roman" w:hAnsi="Times New Roman"/>
+                <w:b w:val="0"/>
+                <w:i w:val="0"/>
+                <w:sz w:val="20"/>
+              </w:rPr>
+              <w:t xml:space="preserve">, </w:t>
+            </w:r>
+            <w:r>
+              <w:rPr>
+                <w:rFonts w:ascii="Consolas" w:hAnsi="Consolas"/>
+                <w:color w:val="003366"/>
+                <w:sz w:val="20"/>
+              </w:rPr>
+              <w:t>ZUE</w:t>
+            </w:r>
+          </w:p>
+        </w:tc>
+      </w:tr>
+      <w:tr>
+        <w:tc>
+          <w:tcPr>
+            <w:tcW w:type="dxa" w:w="1567"/>
+            <w:tcMar>
+              <w:top w:w="100" w:type="dxa"/>
+              <w:bottom w:w="100" w:type="dxa"/>
+              <w:left w:w="120" w:type="dxa"/>
+              <w:right w:w="120" w:type="dxa"/>
+            </w:tcMar>
+          </w:tcPr>
+          <w:p>
+            <w:pPr>
+              <w:spacing w:line="240" w:lineRule="auto" w:before="40" w:after="40"/>
+              <w:ind w:firstLine="0"/>
+              <w:jc w:val="left"/>
+            </w:pPr>
+            <w:r>
+              <w:rPr>
+                <w:rFonts w:ascii="Consolas" w:hAnsi="Consolas"/>
+                <w:color w:val="003366"/>
+                <w:sz w:val="20"/>
+              </w:rPr>
+              <w:t>unidade</w:t>
+            </w:r>
+          </w:p>
+        </w:tc>
+        <w:tc>
+          <w:tcPr>
+            <w:tcW w:type="dxa" w:w="1567"/>
+            <w:tcMar>
+              <w:top w:w="100" w:type="dxa"/>
+              <w:bottom w:w="100" w:type="dxa"/>
+              <w:left w:w="120" w:type="dxa"/>
+              <w:right w:w="120" w:type="dxa"/>
+            </w:tcMar>
+          </w:tcPr>
+          <w:p>
+            <w:pPr>
+              <w:spacing w:line="240" w:lineRule="auto" w:before="40" w:after="40"/>
+              <w:ind w:firstLine="0"/>
+              <w:jc w:val="left"/>
+            </w:pPr>
+            <w:r>
+              <w:rPr>
+                <w:rFonts w:ascii="Times New Roman" w:hAnsi="Times New Roman"/>
+                <w:b w:val="0"/>
+                <w:i w:val="0"/>
+                <w:sz w:val="20"/>
+              </w:rPr>
+              <w:t>C</w:t>
+            </w:r>
+          </w:p>
+        </w:tc>
+        <w:tc>
+          <w:tcPr>
+            <w:tcW w:type="dxa" w:w="1567"/>
+            <w:tcMar>
+              <w:top w:w="100" w:type="dxa"/>
+              <w:bottom w:w="100" w:type="dxa"/>
+              <w:left w:w="120" w:type="dxa"/>
+              <w:right w:w="120" w:type="dxa"/>
+            </w:tcMar>
+          </w:tcPr>
+          <w:p>
+            <w:pPr>
+              <w:spacing w:line="240" w:lineRule="auto" w:before="40" w:after="40"/>
+              <w:ind w:firstLine="0"/>
+              <w:jc w:val="left"/>
+            </w:pPr>
+            <w:r>
+              <w:rPr>
+                <w:rFonts w:ascii="Times New Roman" w:hAnsi="Times New Roman"/>
+                <w:b w:val="0"/>
+                <w:i w:val="0"/>
+                <w:sz w:val="20"/>
+              </w:rPr>
+              <w:t>254</w:t>
+            </w:r>
+          </w:p>
+        </w:tc>
+        <w:tc>
+          <w:tcPr>
+            <w:tcW w:type="dxa" w:w="1567"/>
+            <w:tcMar>
+              <w:top w:w="100" w:type="dxa"/>
+              <w:bottom w:w="100" w:type="dxa"/>
+              <w:left w:w="120" w:type="dxa"/>
+              <w:right w:w="120" w:type="dxa"/>
+            </w:tcMar>
+          </w:tcPr>
+          <w:p>
+            <w:pPr>
+              <w:spacing w:line="240" w:lineRule="auto" w:before="40" w:after="40"/>
+              <w:ind w:firstLine="0"/>
+              <w:jc w:val="left"/>
+            </w:pPr>
+            <w:r>
+              <w:rPr>
+                <w:rFonts w:ascii="Times New Roman" w:hAnsi="Times New Roman"/>
+                <w:b w:val="0"/>
+                <w:i w:val="0"/>
+                <w:sz w:val="20"/>
+              </w:rPr>
+              <w:t>0</w:t>
+            </w:r>
+          </w:p>
+        </w:tc>
+        <w:tc>
+          <w:tcPr>
+            <w:tcW w:type="dxa" w:w="1567"/>
+            <w:tcMar>
+              <w:top w:w="100" w:type="dxa"/>
+              <w:bottom w:w="100" w:type="dxa"/>
+              <w:left w:w="120" w:type="dxa"/>
+              <w:right w:w="120" w:type="dxa"/>
+            </w:tcMar>
+          </w:tcPr>
+          <w:p>
+            <w:pPr>
+              <w:spacing w:line="240" w:lineRule="auto" w:before="40" w:after="40"/>
+              <w:ind w:firstLine="0"/>
+              <w:jc w:val="left"/>
+            </w:pPr>
+            <w:r>
+              <w:rPr>
+                <w:rFonts w:ascii="Times New Roman" w:hAnsi="Times New Roman"/>
+                <w:b w:val="0"/>
+                <w:i w:val="0"/>
+                <w:sz w:val="20"/>
+              </w:rPr>
+              <w:t>Identificador da UC associada (</w:t>
+            </w:r>
+            <w:r>
+              <w:rPr>
+                <w:rFonts w:ascii="Consolas" w:hAnsi="Consolas"/>
+                <w:color w:val="003366"/>
+                <w:sz w:val="20"/>
+              </w:rPr>
+              <w:t>uc_id</w:t>
+            </w:r>
+            <w:r>
+              <w:rPr>
+                <w:rFonts w:ascii="Times New Roman" w:hAnsi="Times New Roman"/>
+                <w:b w:val="0"/>
+                <w:i w:val="0"/>
+                <w:sz w:val="20"/>
+              </w:rPr>
+              <w:t>/</w:t>
+            </w:r>
+            <w:r>
+              <w:rPr>
+                <w:rFonts w:ascii="Consolas" w:hAnsi="Consolas"/>
+                <w:color w:val="003366"/>
+                <w:sz w:val="20"/>
+              </w:rPr>
+              <w:t>cod_cnuc</w:t>
+            </w:r>
+            <w:r>
+              <w:rPr>
+                <w:rFonts w:ascii="Times New Roman" w:hAnsi="Times New Roman"/>
+                <w:b w:val="0"/>
+                <w:i w:val="0"/>
+                <w:sz w:val="20"/>
+              </w:rPr>
+              <w:t>)</w:t>
+            </w:r>
+          </w:p>
+        </w:tc>
+        <w:tc>
+          <w:tcPr>
+            <w:tcW w:type="dxa" w:w="1567"/>
+            <w:tcMar>
+              <w:top w:w="100" w:type="dxa"/>
+              <w:bottom w:w="100" w:type="dxa"/>
+              <w:left w:w="120" w:type="dxa"/>
+              <w:right w:w="120" w:type="dxa"/>
+            </w:tcMar>
+          </w:tcPr>
+          <w:p>
+            <w:pPr>
+              <w:spacing w:line="240" w:lineRule="auto" w:before="40" w:after="40"/>
+              <w:ind w:firstLine="0"/>
+              <w:jc w:val="left"/>
+            </w:pPr>
+            <w:r>
+              <w:rPr>
+                <w:rFonts w:ascii="Consolas" w:hAnsi="Consolas"/>
+                <w:color w:val="003366"/>
+                <w:sz w:val="20"/>
+              </w:rPr>
+              <w:t>PA00001</w:t>
+            </w:r>
+          </w:p>
+        </w:tc>
+      </w:tr>
+    </w:tbl>
+    <w:p>
+      <w:pPr>
+        <w:spacing w:after="120" w:line="240" w:lineRule="auto"/>
+      </w:pPr>
+    </w:p>
+    <w:p>
+      <w:pPr>
+        <w:spacing w:line="360" w:lineRule="auto" w:before="0" w:after="0"/>
+        <w:ind w:firstLine="709"/>
+        <w:jc w:val="both"/>
+      </w:pPr>
+      <w:r>
+        <w:rPr>
+          <w:rFonts w:ascii="Times New Roman" w:hAnsi="Times New Roman"/>
+          <w:b/>
+          <w:i w:val="0"/>
+          <w:sz w:val="24"/>
+        </w:rPr>
+        <w:t>Regra de publicação:</w:t>
+      </w:r>
+      <w:r>
+        <w:rPr>
+          <w:rFonts w:ascii="Times New Roman" w:hAnsi="Times New Roman"/>
+          <w:b w:val="0"/>
+          <w:i w:val="0"/>
+          <w:sz w:val="24"/>
+        </w:rPr>
+        <w:t xml:space="preserve"> nos geoserviços (WMS/WFS) e na Ficha da Unidade, a camada de zoneamento é </w:t>
+      </w:r>
+      <w:r>
+        <w:rPr>
+          <w:rFonts w:ascii="Times New Roman" w:hAnsi="Times New Roman"/>
+          <w:b/>
+          <w:i w:val="0"/>
+          <w:sz w:val="24"/>
+        </w:rPr>
+        <w:t>publicada apenas quando</w:t>
+      </w:r>
+      <w:r>
+        <w:rPr>
+          <w:rFonts w:ascii="Times New Roman" w:hAnsi="Times New Roman"/>
+          <w:b w:val="0"/>
+          <w:i w:val="0"/>
+          <w:sz w:val="24"/>
+        </w:rPr>
+        <w:t xml:space="preserve"> </w:t>
+      </w:r>
+      <w:r>
+        <w:rPr>
+          <w:rFonts w:ascii="Consolas" w:hAnsi="Consolas"/>
+          <w:color w:val="003366"/>
+          <w:sz w:val="20"/>
+        </w:rPr>
+        <w:t>zoneamento_disponivel = SIM</w:t>
+      </w:r>
+      <w:r>
+        <w:rPr>
+          <w:rFonts w:ascii="Times New Roman" w:hAnsi="Times New Roman"/>
+          <w:b w:val="0"/>
+          <w:i w:val="0"/>
+          <w:sz w:val="24"/>
+        </w:rPr>
+        <w:t>; caso contrário, exibe-se aviso "UC sem Plano de Gestão — zoneamento não disponível", permanecendo visíveis apenas perímetro e Zona de Amortecimento.</w:t>
+      </w:r>
+    </w:p>
+    <w:p>
+      <w:pPr>
+        <w:spacing w:line="360" w:lineRule="auto" w:before="120" w:after="120"/>
+        <w:ind w:firstLine="0"/>
+        <w:jc w:val="left"/>
+      </w:pPr>
+      <w:r>
+        <w:rPr>
+          <w:rFonts w:ascii="Times New Roman" w:hAnsi="Times New Roman"/>
+          <w:b/>
+          <w:i/>
+          <w:sz w:val="24"/>
+        </w:rPr>
+        <w:t>3.3. Esquema JSON de Validação (Módulo II)</w:t>
       </w:r>
     </w:p>
     <w:tbl>
@@ -5905,6 +7392,8 @@
               <w:t xml:space="preserve">    "tipo_flore": { "type": "string" },</w:t>
               <w:br/>
               <w:t xml:space="preserve">    "za_delim": { "type": "string", "enum": ["SIM", "NAO"] },</w:t>
+              <w:br/>
+              <w:t xml:space="preserve">    "zoneamento_disponivel": { "type": "string", "enum": ["SIM", "NAO"] },</w:t>
               <w:br/>
               <w:t xml:space="preserve">    "obs": { "type": "string" }</w:t>
               <w:br/>
@@ -8146,6 +9635,1774 @@
           </w:p>
         </w:tc>
       </w:tr>
+      <w:tr>
+        <w:tc>
+          <w:tcPr>
+            <w:tcW w:type="dxa" w:w="1881"/>
+            <w:tcMar>
+              <w:top w:w="100" w:type="dxa"/>
+              <w:bottom w:w="100" w:type="dxa"/>
+              <w:left w:w="120" w:type="dxa"/>
+              <w:right w:w="120" w:type="dxa"/>
+            </w:tcMar>
+          </w:tcPr>
+          <w:p>
+            <w:pPr>
+              <w:spacing w:line="240" w:lineRule="auto" w:before="40" w:after="40"/>
+              <w:ind w:firstLine="0"/>
+              <w:jc w:val="left"/>
+            </w:pPr>
+            <w:r>
+              <w:rPr>
+                <w:rFonts w:ascii="Times New Roman" w:hAnsi="Times New Roman"/>
+                <w:b/>
+                <w:i w:val="0"/>
+                <w:sz w:val="20"/>
+              </w:rPr>
+              <w:t>Gestor Responsável - Nome</w:t>
+            </w:r>
+          </w:p>
+        </w:tc>
+        <w:tc>
+          <w:tcPr>
+            <w:tcW w:type="dxa" w:w="1881"/>
+            <w:tcMar>
+              <w:top w:w="100" w:type="dxa"/>
+              <w:bottom w:w="100" w:type="dxa"/>
+              <w:left w:w="120" w:type="dxa"/>
+              <w:right w:w="120" w:type="dxa"/>
+            </w:tcMar>
+          </w:tcPr>
+          <w:p>
+            <w:pPr>
+              <w:spacing w:line="240" w:lineRule="auto" w:before="40" w:after="40"/>
+              <w:ind w:firstLine="0"/>
+              <w:jc w:val="left"/>
+            </w:pPr>
+            <w:r>
+              <w:rPr>
+                <w:rFonts w:ascii="Consolas" w:hAnsi="Consolas"/>
+                <w:color w:val="003366"/>
+                <w:sz w:val="20"/>
+              </w:rPr>
+              <w:t>gestor_responsavel_nome</w:t>
+            </w:r>
+          </w:p>
+        </w:tc>
+        <w:tc>
+          <w:tcPr>
+            <w:tcW w:type="dxa" w:w="1881"/>
+            <w:tcMar>
+              <w:top w:w="100" w:type="dxa"/>
+              <w:bottom w:w="100" w:type="dxa"/>
+              <w:left w:w="120" w:type="dxa"/>
+              <w:right w:w="120" w:type="dxa"/>
+            </w:tcMar>
+          </w:tcPr>
+          <w:p>
+            <w:pPr>
+              <w:spacing w:line="240" w:lineRule="auto" w:before="40" w:after="40"/>
+              <w:ind w:firstLine="0"/>
+              <w:jc w:val="left"/>
+            </w:pPr>
+            <w:r>
+              <w:rPr>
+                <w:rFonts w:ascii="Times New Roman" w:hAnsi="Times New Roman"/>
+                <w:b w:val="0"/>
+                <w:i w:val="0"/>
+                <w:sz w:val="20"/>
+              </w:rPr>
+              <w:t>Texto (Livre)</w:t>
+            </w:r>
+          </w:p>
+        </w:tc>
+        <w:tc>
+          <w:tcPr>
+            <w:tcW w:type="dxa" w:w="1881"/>
+            <w:tcMar>
+              <w:top w:w="100" w:type="dxa"/>
+              <w:bottom w:w="100" w:type="dxa"/>
+              <w:left w:w="120" w:type="dxa"/>
+              <w:right w:w="120" w:type="dxa"/>
+            </w:tcMar>
+          </w:tcPr>
+          <w:p>
+            <w:pPr>
+              <w:spacing w:line="240" w:lineRule="auto" w:before="40" w:after="40"/>
+              <w:ind w:firstLine="0"/>
+              <w:jc w:val="left"/>
+            </w:pPr>
+            <w:r>
+              <w:rPr>
+                <w:rFonts w:ascii="Times New Roman" w:hAnsi="Times New Roman"/>
+                <w:b w:val="0"/>
+                <w:i w:val="0"/>
+                <w:sz w:val="20"/>
+              </w:rPr>
+              <w:t>Não</w:t>
+            </w:r>
+          </w:p>
+        </w:tc>
+        <w:tc>
+          <w:tcPr>
+            <w:tcW w:type="dxa" w:w="1881"/>
+            <w:tcMar>
+              <w:top w:w="100" w:type="dxa"/>
+              <w:bottom w:w="100" w:type="dxa"/>
+              <w:left w:w="120" w:type="dxa"/>
+              <w:right w:w="120" w:type="dxa"/>
+            </w:tcMar>
+          </w:tcPr>
+          <w:p>
+            <w:pPr>
+              <w:spacing w:line="240" w:lineRule="auto" w:before="40" w:after="40"/>
+              <w:ind w:firstLine="0"/>
+              <w:jc w:val="left"/>
+            </w:pPr>
+            <w:r>
+              <w:rPr>
+                <w:rFonts w:ascii="Times New Roman" w:hAnsi="Times New Roman"/>
+                <w:b w:val="0"/>
+                <w:i w:val="0"/>
+                <w:sz w:val="20"/>
+              </w:rPr>
+              <w:t>Nome do gerente/responsável pela gestão da UC (nível técnico - LGPD).</w:t>
+            </w:r>
+          </w:p>
+        </w:tc>
+      </w:tr>
+      <w:tr>
+        <w:tc>
+          <w:tcPr>
+            <w:tcW w:type="dxa" w:w="1881"/>
+            <w:tcMar>
+              <w:top w:w="100" w:type="dxa"/>
+              <w:bottom w:w="100" w:type="dxa"/>
+              <w:left w:w="120" w:type="dxa"/>
+              <w:right w:w="120" w:type="dxa"/>
+            </w:tcMar>
+          </w:tcPr>
+          <w:p>
+            <w:pPr>
+              <w:spacing w:line="240" w:lineRule="auto" w:before="40" w:after="40"/>
+              <w:ind w:firstLine="0"/>
+              <w:jc w:val="left"/>
+            </w:pPr>
+            <w:r>
+              <w:rPr>
+                <w:rFonts w:ascii="Times New Roman" w:hAnsi="Times New Roman"/>
+                <w:b/>
+                <w:i w:val="0"/>
+                <w:sz w:val="20"/>
+              </w:rPr>
+              <w:t>Gestor Responsável - Cargo</w:t>
+            </w:r>
+          </w:p>
+        </w:tc>
+        <w:tc>
+          <w:tcPr>
+            <w:tcW w:type="dxa" w:w="1881"/>
+            <w:tcMar>
+              <w:top w:w="100" w:type="dxa"/>
+              <w:bottom w:w="100" w:type="dxa"/>
+              <w:left w:w="120" w:type="dxa"/>
+              <w:right w:w="120" w:type="dxa"/>
+            </w:tcMar>
+          </w:tcPr>
+          <w:p>
+            <w:pPr>
+              <w:spacing w:line="240" w:lineRule="auto" w:before="40" w:after="40"/>
+              <w:ind w:firstLine="0"/>
+              <w:jc w:val="left"/>
+            </w:pPr>
+            <w:r>
+              <w:rPr>
+                <w:rFonts w:ascii="Consolas" w:hAnsi="Consolas"/>
+                <w:color w:val="003366"/>
+                <w:sz w:val="20"/>
+              </w:rPr>
+              <w:t>gestor_responsavel_cargo</w:t>
+            </w:r>
+          </w:p>
+        </w:tc>
+        <w:tc>
+          <w:tcPr>
+            <w:tcW w:type="dxa" w:w="1881"/>
+            <w:tcMar>
+              <w:top w:w="100" w:type="dxa"/>
+              <w:bottom w:w="100" w:type="dxa"/>
+              <w:left w:w="120" w:type="dxa"/>
+              <w:right w:w="120" w:type="dxa"/>
+            </w:tcMar>
+          </w:tcPr>
+          <w:p>
+            <w:pPr>
+              <w:spacing w:line="240" w:lineRule="auto" w:before="40" w:after="40"/>
+              <w:ind w:firstLine="0"/>
+              <w:jc w:val="left"/>
+            </w:pPr>
+            <w:r>
+              <w:rPr>
+                <w:rFonts w:ascii="Times New Roman" w:hAnsi="Times New Roman"/>
+                <w:b w:val="0"/>
+                <w:i w:val="0"/>
+                <w:sz w:val="20"/>
+              </w:rPr>
+              <w:t>Texto (Livre)</w:t>
+            </w:r>
+          </w:p>
+        </w:tc>
+        <w:tc>
+          <w:tcPr>
+            <w:tcW w:type="dxa" w:w="1881"/>
+            <w:tcMar>
+              <w:top w:w="100" w:type="dxa"/>
+              <w:bottom w:w="100" w:type="dxa"/>
+              <w:left w:w="120" w:type="dxa"/>
+              <w:right w:w="120" w:type="dxa"/>
+            </w:tcMar>
+          </w:tcPr>
+          <w:p>
+            <w:pPr>
+              <w:spacing w:line="240" w:lineRule="auto" w:before="40" w:after="40"/>
+              <w:ind w:firstLine="0"/>
+              <w:jc w:val="left"/>
+            </w:pPr>
+            <w:r>
+              <w:rPr>
+                <w:rFonts w:ascii="Times New Roman" w:hAnsi="Times New Roman"/>
+                <w:b w:val="0"/>
+                <w:i w:val="0"/>
+                <w:sz w:val="20"/>
+              </w:rPr>
+              <w:t>Não</w:t>
+            </w:r>
+          </w:p>
+        </w:tc>
+        <w:tc>
+          <w:tcPr>
+            <w:tcW w:type="dxa" w:w="1881"/>
+            <w:tcMar>
+              <w:top w:w="100" w:type="dxa"/>
+              <w:bottom w:w="100" w:type="dxa"/>
+              <w:left w:w="120" w:type="dxa"/>
+              <w:right w:w="120" w:type="dxa"/>
+            </w:tcMar>
+          </w:tcPr>
+          <w:p>
+            <w:pPr>
+              <w:spacing w:line="240" w:lineRule="auto" w:before="40" w:after="40"/>
+              <w:ind w:firstLine="0"/>
+              <w:jc w:val="left"/>
+            </w:pPr>
+            <w:r>
+              <w:rPr>
+                <w:rFonts w:ascii="Times New Roman" w:hAnsi="Times New Roman"/>
+                <w:b w:val="0"/>
+                <w:i w:val="0"/>
+                <w:sz w:val="20"/>
+              </w:rPr>
+              <w:t>Cargo/função do responsável pela UC.</w:t>
+            </w:r>
+          </w:p>
+        </w:tc>
+      </w:tr>
+      <w:tr>
+        <w:tc>
+          <w:tcPr>
+            <w:tcW w:type="dxa" w:w="1881"/>
+            <w:tcMar>
+              <w:top w:w="100" w:type="dxa"/>
+              <w:bottom w:w="100" w:type="dxa"/>
+              <w:left w:w="120" w:type="dxa"/>
+              <w:right w:w="120" w:type="dxa"/>
+            </w:tcMar>
+          </w:tcPr>
+          <w:p>
+            <w:pPr>
+              <w:spacing w:line="240" w:lineRule="auto" w:before="40" w:after="40"/>
+              <w:ind w:firstLine="0"/>
+              <w:jc w:val="left"/>
+            </w:pPr>
+            <w:r>
+              <w:rPr>
+                <w:rFonts w:ascii="Times New Roman" w:hAnsi="Times New Roman"/>
+                <w:b/>
+                <w:i w:val="0"/>
+                <w:sz w:val="20"/>
+              </w:rPr>
+              <w:t>Gestor Responsável - E-mail</w:t>
+            </w:r>
+          </w:p>
+        </w:tc>
+        <w:tc>
+          <w:tcPr>
+            <w:tcW w:type="dxa" w:w="1881"/>
+            <w:tcMar>
+              <w:top w:w="100" w:type="dxa"/>
+              <w:bottom w:w="100" w:type="dxa"/>
+              <w:left w:w="120" w:type="dxa"/>
+              <w:right w:w="120" w:type="dxa"/>
+            </w:tcMar>
+          </w:tcPr>
+          <w:p>
+            <w:pPr>
+              <w:spacing w:line="240" w:lineRule="auto" w:before="40" w:after="40"/>
+              <w:ind w:firstLine="0"/>
+              <w:jc w:val="left"/>
+            </w:pPr>
+            <w:r>
+              <w:rPr>
+                <w:rFonts w:ascii="Consolas" w:hAnsi="Consolas"/>
+                <w:color w:val="003366"/>
+                <w:sz w:val="20"/>
+              </w:rPr>
+              <w:t>gestor_contato_email</w:t>
+            </w:r>
+          </w:p>
+        </w:tc>
+        <w:tc>
+          <w:tcPr>
+            <w:tcW w:type="dxa" w:w="1881"/>
+            <w:tcMar>
+              <w:top w:w="100" w:type="dxa"/>
+              <w:bottom w:w="100" w:type="dxa"/>
+              <w:left w:w="120" w:type="dxa"/>
+              <w:right w:w="120" w:type="dxa"/>
+            </w:tcMar>
+          </w:tcPr>
+          <w:p>
+            <w:pPr>
+              <w:spacing w:line="240" w:lineRule="auto" w:before="40" w:after="40"/>
+              <w:ind w:firstLine="0"/>
+              <w:jc w:val="left"/>
+            </w:pPr>
+            <w:r>
+              <w:rPr>
+                <w:rFonts w:ascii="Times New Roman" w:hAnsi="Times New Roman"/>
+                <w:b w:val="0"/>
+                <w:i w:val="0"/>
+                <w:sz w:val="20"/>
+              </w:rPr>
+              <w:t>Texto (Livre)</w:t>
+            </w:r>
+          </w:p>
+        </w:tc>
+        <w:tc>
+          <w:tcPr>
+            <w:tcW w:type="dxa" w:w="1881"/>
+            <w:tcMar>
+              <w:top w:w="100" w:type="dxa"/>
+              <w:bottom w:w="100" w:type="dxa"/>
+              <w:left w:w="120" w:type="dxa"/>
+              <w:right w:w="120" w:type="dxa"/>
+            </w:tcMar>
+          </w:tcPr>
+          <w:p>
+            <w:pPr>
+              <w:spacing w:line="240" w:lineRule="auto" w:before="40" w:after="40"/>
+              <w:ind w:firstLine="0"/>
+              <w:jc w:val="left"/>
+            </w:pPr>
+            <w:r>
+              <w:rPr>
+                <w:rFonts w:ascii="Times New Roman" w:hAnsi="Times New Roman"/>
+                <w:b w:val="0"/>
+                <w:i w:val="0"/>
+                <w:sz w:val="20"/>
+              </w:rPr>
+              <w:t>Não</w:t>
+            </w:r>
+          </w:p>
+        </w:tc>
+        <w:tc>
+          <w:tcPr>
+            <w:tcW w:type="dxa" w:w="1881"/>
+            <w:tcMar>
+              <w:top w:w="100" w:type="dxa"/>
+              <w:bottom w:w="100" w:type="dxa"/>
+              <w:left w:w="120" w:type="dxa"/>
+              <w:right w:w="120" w:type="dxa"/>
+            </w:tcMar>
+          </w:tcPr>
+          <w:p>
+            <w:pPr>
+              <w:spacing w:line="240" w:lineRule="auto" w:before="40" w:after="40"/>
+              <w:ind w:firstLine="0"/>
+              <w:jc w:val="left"/>
+            </w:pPr>
+            <w:r>
+              <w:rPr>
+                <w:rFonts w:ascii="Times New Roman" w:hAnsi="Times New Roman"/>
+                <w:b w:val="0"/>
+                <w:i w:val="0"/>
+                <w:sz w:val="20"/>
+              </w:rPr>
+              <w:t>E-mail institucional de contato (nível técnico - LGPD).</w:t>
+            </w:r>
+          </w:p>
+        </w:tc>
+      </w:tr>
+      <w:tr>
+        <w:tc>
+          <w:tcPr>
+            <w:tcW w:type="dxa" w:w="1881"/>
+            <w:tcMar>
+              <w:top w:w="100" w:type="dxa"/>
+              <w:bottom w:w="100" w:type="dxa"/>
+              <w:left w:w="120" w:type="dxa"/>
+              <w:right w:w="120" w:type="dxa"/>
+            </w:tcMar>
+          </w:tcPr>
+          <w:p>
+            <w:pPr>
+              <w:spacing w:line="240" w:lineRule="auto" w:before="40" w:after="40"/>
+              <w:ind w:firstLine="0"/>
+              <w:jc w:val="left"/>
+            </w:pPr>
+            <w:r>
+              <w:rPr>
+                <w:rFonts w:ascii="Times New Roman" w:hAnsi="Times New Roman"/>
+                <w:b/>
+                <w:i w:val="0"/>
+                <w:sz w:val="20"/>
+              </w:rPr>
+              <w:t>Ato de Designação do Gestor</w:t>
+            </w:r>
+          </w:p>
+        </w:tc>
+        <w:tc>
+          <w:tcPr>
+            <w:tcW w:type="dxa" w:w="1881"/>
+            <w:tcMar>
+              <w:top w:w="100" w:type="dxa"/>
+              <w:bottom w:w="100" w:type="dxa"/>
+              <w:left w:w="120" w:type="dxa"/>
+              <w:right w:w="120" w:type="dxa"/>
+            </w:tcMar>
+          </w:tcPr>
+          <w:p>
+            <w:pPr>
+              <w:spacing w:line="240" w:lineRule="auto" w:before="40" w:after="40"/>
+              <w:ind w:firstLine="0"/>
+              <w:jc w:val="left"/>
+            </w:pPr>
+            <w:r>
+              <w:rPr>
+                <w:rFonts w:ascii="Consolas" w:hAnsi="Consolas"/>
+                <w:color w:val="003366"/>
+                <w:sz w:val="20"/>
+              </w:rPr>
+              <w:t>gestor_nomeacao_ato</w:t>
+            </w:r>
+          </w:p>
+        </w:tc>
+        <w:tc>
+          <w:tcPr>
+            <w:tcW w:type="dxa" w:w="1881"/>
+            <w:tcMar>
+              <w:top w:w="100" w:type="dxa"/>
+              <w:bottom w:w="100" w:type="dxa"/>
+              <w:left w:w="120" w:type="dxa"/>
+              <w:right w:w="120" w:type="dxa"/>
+            </w:tcMar>
+          </w:tcPr>
+          <w:p>
+            <w:pPr>
+              <w:spacing w:line="240" w:lineRule="auto" w:before="40" w:after="40"/>
+              <w:ind w:firstLine="0"/>
+              <w:jc w:val="left"/>
+            </w:pPr>
+            <w:r>
+              <w:rPr>
+                <w:rFonts w:ascii="Times New Roman" w:hAnsi="Times New Roman"/>
+                <w:b w:val="0"/>
+                <w:i w:val="0"/>
+                <w:sz w:val="20"/>
+              </w:rPr>
+              <w:t>Texto (Livre)</w:t>
+            </w:r>
+          </w:p>
+        </w:tc>
+        <w:tc>
+          <w:tcPr>
+            <w:tcW w:type="dxa" w:w="1881"/>
+            <w:tcMar>
+              <w:top w:w="100" w:type="dxa"/>
+              <w:bottom w:w="100" w:type="dxa"/>
+              <w:left w:w="120" w:type="dxa"/>
+              <w:right w:w="120" w:type="dxa"/>
+            </w:tcMar>
+          </w:tcPr>
+          <w:p>
+            <w:pPr>
+              <w:spacing w:line="240" w:lineRule="auto" w:before="40" w:after="40"/>
+              <w:ind w:firstLine="0"/>
+              <w:jc w:val="left"/>
+            </w:pPr>
+            <w:r>
+              <w:rPr>
+                <w:rFonts w:ascii="Times New Roman" w:hAnsi="Times New Roman"/>
+                <w:b w:val="0"/>
+                <w:i w:val="0"/>
+                <w:sz w:val="20"/>
+              </w:rPr>
+              <w:t>Não</w:t>
+            </w:r>
+          </w:p>
+        </w:tc>
+        <w:tc>
+          <w:tcPr>
+            <w:tcW w:type="dxa" w:w="1881"/>
+            <w:tcMar>
+              <w:top w:w="100" w:type="dxa"/>
+              <w:bottom w:w="100" w:type="dxa"/>
+              <w:left w:w="120" w:type="dxa"/>
+              <w:right w:w="120" w:type="dxa"/>
+            </w:tcMar>
+          </w:tcPr>
+          <w:p>
+            <w:pPr>
+              <w:spacing w:line="240" w:lineRule="auto" w:before="40" w:after="40"/>
+              <w:ind w:firstLine="0"/>
+              <w:jc w:val="left"/>
+            </w:pPr>
+            <w:r>
+              <w:rPr>
+                <w:rFonts w:ascii="Times New Roman" w:hAnsi="Times New Roman"/>
+                <w:b w:val="0"/>
+                <w:i w:val="0"/>
+                <w:sz w:val="20"/>
+              </w:rPr>
+              <w:t>Portaria/decreto de designação do gestor responsável.</w:t>
+            </w:r>
+          </w:p>
+        </w:tc>
+      </w:tr>
+      <w:tr>
+        <w:tc>
+          <w:tcPr>
+            <w:tcW w:type="dxa" w:w="1881"/>
+            <w:tcMar>
+              <w:top w:w="100" w:type="dxa"/>
+              <w:bottom w:w="100" w:type="dxa"/>
+              <w:left w:w="120" w:type="dxa"/>
+              <w:right w:w="120" w:type="dxa"/>
+            </w:tcMar>
+          </w:tcPr>
+          <w:p>
+            <w:pPr>
+              <w:spacing w:line="240" w:lineRule="auto" w:before="40" w:after="40"/>
+              <w:ind w:firstLine="0"/>
+              <w:jc w:val="left"/>
+            </w:pPr>
+            <w:r>
+              <w:rPr>
+                <w:rFonts w:ascii="Times New Roman" w:hAnsi="Times New Roman"/>
+                <w:b/>
+                <w:i w:val="0"/>
+                <w:sz w:val="20"/>
+              </w:rPr>
+              <w:t>Composição do Conselho</w:t>
+            </w:r>
+          </w:p>
+        </w:tc>
+        <w:tc>
+          <w:tcPr>
+            <w:tcW w:type="dxa" w:w="1881"/>
+            <w:tcMar>
+              <w:top w:w="100" w:type="dxa"/>
+              <w:bottom w:w="100" w:type="dxa"/>
+              <w:left w:w="120" w:type="dxa"/>
+              <w:right w:w="120" w:type="dxa"/>
+            </w:tcMar>
+          </w:tcPr>
+          <w:p>
+            <w:pPr>
+              <w:spacing w:line="240" w:lineRule="auto" w:before="40" w:after="40"/>
+              <w:ind w:firstLine="0"/>
+              <w:jc w:val="left"/>
+            </w:pPr>
+            <w:r>
+              <w:rPr>
+                <w:rFonts w:ascii="Consolas" w:hAnsi="Consolas"/>
+                <w:color w:val="003366"/>
+                <w:sz w:val="20"/>
+              </w:rPr>
+              <w:t>conselho_composicao</w:t>
+            </w:r>
+          </w:p>
+        </w:tc>
+        <w:tc>
+          <w:tcPr>
+            <w:tcW w:type="dxa" w:w="1881"/>
+            <w:tcMar>
+              <w:top w:w="100" w:type="dxa"/>
+              <w:bottom w:w="100" w:type="dxa"/>
+              <w:left w:w="120" w:type="dxa"/>
+              <w:right w:w="120" w:type="dxa"/>
+            </w:tcMar>
+          </w:tcPr>
+          <w:p>
+            <w:pPr>
+              <w:spacing w:line="240" w:lineRule="auto" w:before="40" w:after="40"/>
+              <w:ind w:firstLine="0"/>
+              <w:jc w:val="left"/>
+            </w:pPr>
+            <w:r>
+              <w:rPr>
+                <w:rFonts w:ascii="Times New Roman" w:hAnsi="Times New Roman"/>
+                <w:b w:val="0"/>
+                <w:i w:val="0"/>
+                <w:sz w:val="20"/>
+              </w:rPr>
+              <w:t>Lista Objetos</w:t>
+            </w:r>
+          </w:p>
+        </w:tc>
+        <w:tc>
+          <w:tcPr>
+            <w:tcW w:type="dxa" w:w="1881"/>
+            <w:tcMar>
+              <w:top w:w="100" w:type="dxa"/>
+              <w:bottom w:w="100" w:type="dxa"/>
+              <w:left w:w="120" w:type="dxa"/>
+              <w:right w:w="120" w:type="dxa"/>
+            </w:tcMar>
+          </w:tcPr>
+          <w:p>
+            <w:pPr>
+              <w:spacing w:line="240" w:lineRule="auto" w:before="40" w:after="40"/>
+              <w:ind w:firstLine="0"/>
+              <w:jc w:val="left"/>
+            </w:pPr>
+            <w:r>
+              <w:rPr>
+                <w:rFonts w:ascii="Times New Roman" w:hAnsi="Times New Roman"/>
+                <w:b w:val="0"/>
+                <w:i w:val="0"/>
+                <w:sz w:val="20"/>
+              </w:rPr>
+              <w:t>Não</w:t>
+            </w:r>
+          </w:p>
+        </w:tc>
+        <w:tc>
+          <w:tcPr>
+            <w:tcW w:type="dxa" w:w="1881"/>
+            <w:tcMar>
+              <w:top w:w="100" w:type="dxa"/>
+              <w:bottom w:w="100" w:type="dxa"/>
+              <w:left w:w="120" w:type="dxa"/>
+              <w:right w:w="120" w:type="dxa"/>
+            </w:tcMar>
+          </w:tcPr>
+          <w:p>
+            <w:pPr>
+              <w:spacing w:line="240" w:lineRule="auto" w:before="40" w:after="40"/>
+              <w:ind w:firstLine="0"/>
+              <w:jc w:val="left"/>
+            </w:pPr>
+            <w:r>
+              <w:rPr>
+                <w:rFonts w:ascii="Times New Roman" w:hAnsi="Times New Roman"/>
+                <w:b w:val="0"/>
+                <w:i w:val="0"/>
+                <w:sz w:val="20"/>
+              </w:rPr>
+              <w:t>Membros do conselho (nome institucional, segmento e mandato).</w:t>
+            </w:r>
+          </w:p>
+        </w:tc>
+      </w:tr>
+      <w:tr>
+        <w:tc>
+          <w:tcPr>
+            <w:tcW w:type="dxa" w:w="1881"/>
+            <w:tcMar>
+              <w:top w:w="100" w:type="dxa"/>
+              <w:bottom w:w="100" w:type="dxa"/>
+              <w:left w:w="120" w:type="dxa"/>
+              <w:right w:w="120" w:type="dxa"/>
+            </w:tcMar>
+          </w:tcPr>
+          <w:p>
+            <w:pPr>
+              <w:spacing w:line="240" w:lineRule="auto" w:before="40" w:after="40"/>
+              <w:ind w:firstLine="0"/>
+              <w:jc w:val="left"/>
+            </w:pPr>
+            <w:r>
+              <w:rPr>
+                <w:rFonts w:ascii="Times New Roman" w:hAnsi="Times New Roman"/>
+                <w:b/>
+                <w:i w:val="0"/>
+                <w:sz w:val="20"/>
+              </w:rPr>
+              <w:t>Versão do Plano de Gestão</w:t>
+            </w:r>
+          </w:p>
+        </w:tc>
+        <w:tc>
+          <w:tcPr>
+            <w:tcW w:type="dxa" w:w="1881"/>
+            <w:tcMar>
+              <w:top w:w="100" w:type="dxa"/>
+              <w:bottom w:w="100" w:type="dxa"/>
+              <w:left w:w="120" w:type="dxa"/>
+              <w:right w:w="120" w:type="dxa"/>
+            </w:tcMar>
+          </w:tcPr>
+          <w:p>
+            <w:pPr>
+              <w:spacing w:line="240" w:lineRule="auto" w:before="40" w:after="40"/>
+              <w:ind w:firstLine="0"/>
+              <w:jc w:val="left"/>
+            </w:pPr>
+            <w:r>
+              <w:rPr>
+                <w:rFonts w:ascii="Consolas" w:hAnsi="Consolas"/>
+                <w:color w:val="003366"/>
+                <w:sz w:val="20"/>
+              </w:rPr>
+              <w:t>plano_gestao_versao</w:t>
+            </w:r>
+          </w:p>
+        </w:tc>
+        <w:tc>
+          <w:tcPr>
+            <w:tcW w:type="dxa" w:w="1881"/>
+            <w:tcMar>
+              <w:top w:w="100" w:type="dxa"/>
+              <w:bottom w:w="100" w:type="dxa"/>
+              <w:left w:w="120" w:type="dxa"/>
+              <w:right w:w="120" w:type="dxa"/>
+            </w:tcMar>
+          </w:tcPr>
+          <w:p>
+            <w:pPr>
+              <w:spacing w:line="240" w:lineRule="auto" w:before="40" w:after="40"/>
+              <w:ind w:firstLine="0"/>
+              <w:jc w:val="left"/>
+            </w:pPr>
+            <w:r>
+              <w:rPr>
+                <w:rFonts w:ascii="Times New Roman" w:hAnsi="Times New Roman"/>
+                <w:b w:val="0"/>
+                <w:i w:val="0"/>
+                <w:sz w:val="20"/>
+              </w:rPr>
+              <w:t>Texto (Livre)</w:t>
+            </w:r>
+          </w:p>
+        </w:tc>
+        <w:tc>
+          <w:tcPr>
+            <w:tcW w:type="dxa" w:w="1881"/>
+            <w:tcMar>
+              <w:top w:w="100" w:type="dxa"/>
+              <w:bottom w:w="100" w:type="dxa"/>
+              <w:left w:w="120" w:type="dxa"/>
+              <w:right w:w="120" w:type="dxa"/>
+            </w:tcMar>
+          </w:tcPr>
+          <w:p>
+            <w:pPr>
+              <w:spacing w:line="240" w:lineRule="auto" w:before="40" w:after="40"/>
+              <w:ind w:firstLine="0"/>
+              <w:jc w:val="left"/>
+            </w:pPr>
+            <w:r>
+              <w:rPr>
+                <w:rFonts w:ascii="Times New Roman" w:hAnsi="Times New Roman"/>
+                <w:b w:val="0"/>
+                <w:i w:val="0"/>
+                <w:sz w:val="20"/>
+              </w:rPr>
+              <w:t>Não</w:t>
+            </w:r>
+          </w:p>
+        </w:tc>
+        <w:tc>
+          <w:tcPr>
+            <w:tcW w:type="dxa" w:w="1881"/>
+            <w:tcMar>
+              <w:top w:w="100" w:type="dxa"/>
+              <w:bottom w:w="100" w:type="dxa"/>
+              <w:left w:w="120" w:type="dxa"/>
+              <w:right w:w="120" w:type="dxa"/>
+            </w:tcMar>
+          </w:tcPr>
+          <w:p>
+            <w:pPr>
+              <w:spacing w:line="240" w:lineRule="auto" w:before="40" w:after="40"/>
+              <w:ind w:firstLine="0"/>
+              <w:jc w:val="left"/>
+            </w:pPr>
+            <w:r>
+              <w:rPr>
+                <w:rFonts w:ascii="Times New Roman" w:hAnsi="Times New Roman"/>
+                <w:b w:val="0"/>
+                <w:i w:val="0"/>
+                <w:sz w:val="20"/>
+              </w:rPr>
+              <w:t>Identificação da versão vigente do Plano de Gestão.</w:t>
+            </w:r>
+          </w:p>
+        </w:tc>
+      </w:tr>
+      <w:tr>
+        <w:tc>
+          <w:tcPr>
+            <w:tcW w:type="dxa" w:w="1881"/>
+            <w:tcMar>
+              <w:top w:w="100" w:type="dxa"/>
+              <w:bottom w:w="100" w:type="dxa"/>
+              <w:left w:w="120" w:type="dxa"/>
+              <w:right w:w="120" w:type="dxa"/>
+            </w:tcMar>
+          </w:tcPr>
+          <w:p>
+            <w:pPr>
+              <w:spacing w:line="240" w:lineRule="auto" w:before="40" w:after="40"/>
+              <w:ind w:firstLine="0"/>
+              <w:jc w:val="left"/>
+            </w:pPr>
+            <w:r>
+              <w:rPr>
+                <w:rFonts w:ascii="Times New Roman" w:hAnsi="Times New Roman"/>
+                <w:b/>
+                <w:i w:val="0"/>
+                <w:sz w:val="20"/>
+              </w:rPr>
+              <w:t>Histórico/Estudos do Plano</w:t>
+            </w:r>
+          </w:p>
+        </w:tc>
+        <w:tc>
+          <w:tcPr>
+            <w:tcW w:type="dxa" w:w="1881"/>
+            <w:tcMar>
+              <w:top w:w="100" w:type="dxa"/>
+              <w:bottom w:w="100" w:type="dxa"/>
+              <w:left w:w="120" w:type="dxa"/>
+              <w:right w:w="120" w:type="dxa"/>
+            </w:tcMar>
+          </w:tcPr>
+          <w:p>
+            <w:pPr>
+              <w:spacing w:line="240" w:lineRule="auto" w:before="40" w:after="40"/>
+              <w:ind w:firstLine="0"/>
+              <w:jc w:val="left"/>
+            </w:pPr>
+            <w:r>
+              <w:rPr>
+                <w:rFonts w:ascii="Consolas" w:hAnsi="Consolas"/>
+                <w:color w:val="003366"/>
+                <w:sz w:val="20"/>
+              </w:rPr>
+              <w:t>plano_gestao_atualizacoes</w:t>
+            </w:r>
+          </w:p>
+        </w:tc>
+        <w:tc>
+          <w:tcPr>
+            <w:tcW w:type="dxa" w:w="1881"/>
+            <w:tcMar>
+              <w:top w:w="100" w:type="dxa"/>
+              <w:bottom w:w="100" w:type="dxa"/>
+              <w:left w:w="120" w:type="dxa"/>
+              <w:right w:w="120" w:type="dxa"/>
+            </w:tcMar>
+          </w:tcPr>
+          <w:p>
+            <w:pPr>
+              <w:spacing w:line="240" w:lineRule="auto" w:before="40" w:after="40"/>
+              <w:ind w:firstLine="0"/>
+              <w:jc w:val="left"/>
+            </w:pPr>
+            <w:r>
+              <w:rPr>
+                <w:rFonts w:ascii="Times New Roman" w:hAnsi="Times New Roman"/>
+                <w:b w:val="0"/>
+                <w:i w:val="0"/>
+                <w:sz w:val="20"/>
+              </w:rPr>
+              <w:t>Texto (Livre)</w:t>
+            </w:r>
+          </w:p>
+        </w:tc>
+        <w:tc>
+          <w:tcPr>
+            <w:tcW w:type="dxa" w:w="1881"/>
+            <w:tcMar>
+              <w:top w:w="100" w:type="dxa"/>
+              <w:bottom w:w="100" w:type="dxa"/>
+              <w:left w:w="120" w:type="dxa"/>
+              <w:right w:w="120" w:type="dxa"/>
+            </w:tcMar>
+          </w:tcPr>
+          <w:p>
+            <w:pPr>
+              <w:spacing w:line="240" w:lineRule="auto" w:before="40" w:after="40"/>
+              <w:ind w:firstLine="0"/>
+              <w:jc w:val="left"/>
+            </w:pPr>
+            <w:r>
+              <w:rPr>
+                <w:rFonts w:ascii="Times New Roman" w:hAnsi="Times New Roman"/>
+                <w:b w:val="0"/>
+                <w:i w:val="0"/>
+                <w:sz w:val="20"/>
+              </w:rPr>
+              <w:t>Não</w:t>
+            </w:r>
+          </w:p>
+        </w:tc>
+        <w:tc>
+          <w:tcPr>
+            <w:tcW w:type="dxa" w:w="1881"/>
+            <w:tcMar>
+              <w:top w:w="100" w:type="dxa"/>
+              <w:bottom w:w="100" w:type="dxa"/>
+              <w:left w:w="120" w:type="dxa"/>
+              <w:right w:w="120" w:type="dxa"/>
+            </w:tcMar>
+          </w:tcPr>
+          <w:p>
+            <w:pPr>
+              <w:spacing w:line="240" w:lineRule="auto" w:before="40" w:after="40"/>
+              <w:ind w:firstLine="0"/>
+              <w:jc w:val="left"/>
+            </w:pPr>
+            <w:r>
+              <w:rPr>
+                <w:rFonts w:ascii="Times New Roman" w:hAnsi="Times New Roman"/>
+                <w:b w:val="0"/>
+                <w:i w:val="0"/>
+                <w:sz w:val="20"/>
+              </w:rPr>
+              <w:t>Histórico de atualizações e estudos complementares do Plano de Gestão.</w:t>
+            </w:r>
+          </w:p>
+        </w:tc>
+      </w:tr>
+      <w:tr>
+        <w:tc>
+          <w:tcPr>
+            <w:tcW w:type="dxa" w:w="1881"/>
+            <w:tcMar>
+              <w:top w:w="100" w:type="dxa"/>
+              <w:bottom w:w="100" w:type="dxa"/>
+              <w:left w:w="120" w:type="dxa"/>
+              <w:right w:w="120" w:type="dxa"/>
+            </w:tcMar>
+          </w:tcPr>
+          <w:p>
+            <w:pPr>
+              <w:spacing w:line="240" w:lineRule="auto" w:before="40" w:after="40"/>
+              <w:ind w:firstLine="0"/>
+              <w:jc w:val="left"/>
+            </w:pPr>
+            <w:r>
+              <w:rPr>
+                <w:rFonts w:ascii="Times New Roman" w:hAnsi="Times New Roman"/>
+                <w:b/>
+                <w:i w:val="0"/>
+                <w:sz w:val="20"/>
+              </w:rPr>
+              <w:t>Projetos em Execução</w:t>
+            </w:r>
+          </w:p>
+        </w:tc>
+        <w:tc>
+          <w:tcPr>
+            <w:tcW w:type="dxa" w:w="1881"/>
+            <w:tcMar>
+              <w:top w:w="100" w:type="dxa"/>
+              <w:bottom w:w="100" w:type="dxa"/>
+              <w:left w:w="120" w:type="dxa"/>
+              <w:right w:w="120" w:type="dxa"/>
+            </w:tcMar>
+          </w:tcPr>
+          <w:p>
+            <w:pPr>
+              <w:spacing w:line="240" w:lineRule="auto" w:before="40" w:after="40"/>
+              <w:ind w:firstLine="0"/>
+              <w:jc w:val="left"/>
+            </w:pPr>
+            <w:r>
+              <w:rPr>
+                <w:rFonts w:ascii="Consolas" w:hAnsi="Consolas"/>
+                <w:color w:val="003366"/>
+                <w:sz w:val="20"/>
+              </w:rPr>
+              <w:t>projetos</w:t>
+            </w:r>
+          </w:p>
+        </w:tc>
+        <w:tc>
+          <w:tcPr>
+            <w:tcW w:type="dxa" w:w="1881"/>
+            <w:tcMar>
+              <w:top w:w="100" w:type="dxa"/>
+              <w:bottom w:w="100" w:type="dxa"/>
+              <w:left w:w="120" w:type="dxa"/>
+              <w:right w:w="120" w:type="dxa"/>
+            </w:tcMar>
+          </w:tcPr>
+          <w:p>
+            <w:pPr>
+              <w:spacing w:line="240" w:lineRule="auto" w:before="40" w:after="40"/>
+              <w:ind w:firstLine="0"/>
+              <w:jc w:val="left"/>
+            </w:pPr>
+            <w:r>
+              <w:rPr>
+                <w:rFonts w:ascii="Times New Roman" w:hAnsi="Times New Roman"/>
+                <w:b w:val="0"/>
+                <w:i w:val="0"/>
+                <w:sz w:val="20"/>
+              </w:rPr>
+              <w:t>Lista Objetos</w:t>
+            </w:r>
+          </w:p>
+        </w:tc>
+        <w:tc>
+          <w:tcPr>
+            <w:tcW w:type="dxa" w:w="1881"/>
+            <w:tcMar>
+              <w:top w:w="100" w:type="dxa"/>
+              <w:bottom w:w="100" w:type="dxa"/>
+              <w:left w:w="120" w:type="dxa"/>
+              <w:right w:w="120" w:type="dxa"/>
+            </w:tcMar>
+          </w:tcPr>
+          <w:p>
+            <w:pPr>
+              <w:spacing w:line="240" w:lineRule="auto" w:before="40" w:after="40"/>
+              <w:ind w:firstLine="0"/>
+              <w:jc w:val="left"/>
+            </w:pPr>
+            <w:r>
+              <w:rPr>
+                <w:rFonts w:ascii="Times New Roman" w:hAnsi="Times New Roman"/>
+                <w:b w:val="0"/>
+                <w:i w:val="0"/>
+                <w:sz w:val="20"/>
+              </w:rPr>
+              <w:t>Não</w:t>
+            </w:r>
+          </w:p>
+        </w:tc>
+        <w:tc>
+          <w:tcPr>
+            <w:tcW w:type="dxa" w:w="1881"/>
+            <w:tcMar>
+              <w:top w:w="100" w:type="dxa"/>
+              <w:bottom w:w="100" w:type="dxa"/>
+              <w:left w:w="120" w:type="dxa"/>
+              <w:right w:w="120" w:type="dxa"/>
+            </w:tcMar>
+          </w:tcPr>
+          <w:p>
+            <w:pPr>
+              <w:spacing w:line="240" w:lineRule="auto" w:before="40" w:after="40"/>
+              <w:ind w:firstLine="0"/>
+              <w:jc w:val="left"/>
+            </w:pPr>
+            <w:r>
+              <w:rPr>
+                <w:rFonts w:ascii="Times New Roman" w:hAnsi="Times New Roman"/>
+                <w:b w:val="0"/>
+                <w:i w:val="0"/>
+                <w:sz w:val="20"/>
+              </w:rPr>
+              <w:t>Projetos e programas em execução (turismo, educação ambiental, recuperação, pesquisa etc.).</w:t>
+            </w:r>
+          </w:p>
+        </w:tc>
+      </w:tr>
+      <w:tr>
+        <w:tc>
+          <w:tcPr>
+            <w:tcW w:type="dxa" w:w="1881"/>
+            <w:tcMar>
+              <w:top w:w="100" w:type="dxa"/>
+              <w:bottom w:w="100" w:type="dxa"/>
+              <w:left w:w="120" w:type="dxa"/>
+              <w:right w:w="120" w:type="dxa"/>
+            </w:tcMar>
+          </w:tcPr>
+          <w:p>
+            <w:pPr>
+              <w:spacing w:line="240" w:lineRule="auto" w:before="40" w:after="40"/>
+              <w:ind w:firstLine="0"/>
+              <w:jc w:val="left"/>
+            </w:pPr>
+            <w:r>
+              <w:rPr>
+                <w:rFonts w:ascii="Times New Roman" w:hAnsi="Times New Roman"/>
+                <w:b/>
+                <w:i w:val="0"/>
+                <w:sz w:val="20"/>
+              </w:rPr>
+              <w:t>Cooperações Vigentes</w:t>
+            </w:r>
+          </w:p>
+        </w:tc>
+        <w:tc>
+          <w:tcPr>
+            <w:tcW w:type="dxa" w:w="1881"/>
+            <w:tcMar>
+              <w:top w:w="100" w:type="dxa"/>
+              <w:bottom w:w="100" w:type="dxa"/>
+              <w:left w:w="120" w:type="dxa"/>
+              <w:right w:w="120" w:type="dxa"/>
+            </w:tcMar>
+          </w:tcPr>
+          <w:p>
+            <w:pPr>
+              <w:spacing w:line="240" w:lineRule="auto" w:before="40" w:after="40"/>
+              <w:ind w:firstLine="0"/>
+              <w:jc w:val="left"/>
+            </w:pPr>
+            <w:r>
+              <w:rPr>
+                <w:rFonts w:ascii="Consolas" w:hAnsi="Consolas"/>
+                <w:color w:val="003366"/>
+                <w:sz w:val="20"/>
+              </w:rPr>
+              <w:t>cooperacoes</w:t>
+            </w:r>
+          </w:p>
+        </w:tc>
+        <w:tc>
+          <w:tcPr>
+            <w:tcW w:type="dxa" w:w="1881"/>
+            <w:tcMar>
+              <w:top w:w="100" w:type="dxa"/>
+              <w:bottom w:w="100" w:type="dxa"/>
+              <w:left w:w="120" w:type="dxa"/>
+              <w:right w:w="120" w:type="dxa"/>
+            </w:tcMar>
+          </w:tcPr>
+          <w:p>
+            <w:pPr>
+              <w:spacing w:line="240" w:lineRule="auto" w:before="40" w:after="40"/>
+              <w:ind w:firstLine="0"/>
+              <w:jc w:val="left"/>
+            </w:pPr>
+            <w:r>
+              <w:rPr>
+                <w:rFonts w:ascii="Times New Roman" w:hAnsi="Times New Roman"/>
+                <w:b w:val="0"/>
+                <w:i w:val="0"/>
+                <w:sz w:val="20"/>
+              </w:rPr>
+              <w:t>Lista Objetos</w:t>
+            </w:r>
+          </w:p>
+        </w:tc>
+        <w:tc>
+          <w:tcPr>
+            <w:tcW w:type="dxa" w:w="1881"/>
+            <w:tcMar>
+              <w:top w:w="100" w:type="dxa"/>
+              <w:bottom w:w="100" w:type="dxa"/>
+              <w:left w:w="120" w:type="dxa"/>
+              <w:right w:w="120" w:type="dxa"/>
+            </w:tcMar>
+          </w:tcPr>
+          <w:p>
+            <w:pPr>
+              <w:spacing w:line="240" w:lineRule="auto" w:before="40" w:after="40"/>
+              <w:ind w:firstLine="0"/>
+              <w:jc w:val="left"/>
+            </w:pPr>
+            <w:r>
+              <w:rPr>
+                <w:rFonts w:ascii="Times New Roman" w:hAnsi="Times New Roman"/>
+                <w:b w:val="0"/>
+                <w:i w:val="0"/>
+                <w:sz w:val="20"/>
+              </w:rPr>
+              <w:t>Não</w:t>
+            </w:r>
+          </w:p>
+        </w:tc>
+        <w:tc>
+          <w:tcPr>
+            <w:tcW w:type="dxa" w:w="1881"/>
+            <w:tcMar>
+              <w:top w:w="100" w:type="dxa"/>
+              <w:bottom w:w="100" w:type="dxa"/>
+              <w:left w:w="120" w:type="dxa"/>
+              <w:right w:w="120" w:type="dxa"/>
+            </w:tcMar>
+          </w:tcPr>
+          <w:p>
+            <w:pPr>
+              <w:spacing w:line="240" w:lineRule="auto" w:before="40" w:after="40"/>
+              <w:ind w:firstLine="0"/>
+              <w:jc w:val="left"/>
+            </w:pPr>
+            <w:r>
+              <w:rPr>
+                <w:rFonts w:ascii="Times New Roman" w:hAnsi="Times New Roman"/>
+                <w:b w:val="0"/>
+                <w:i w:val="0"/>
+                <w:sz w:val="20"/>
+              </w:rPr>
+              <w:t>Termos de Cooperação Técnica/convênios vigentes.</w:t>
+            </w:r>
+          </w:p>
+        </w:tc>
+      </w:tr>
+      <w:tr>
+        <w:tc>
+          <w:tcPr>
+            <w:tcW w:type="dxa" w:w="1881"/>
+            <w:tcMar>
+              <w:top w:w="100" w:type="dxa"/>
+              <w:bottom w:w="100" w:type="dxa"/>
+              <w:left w:w="120" w:type="dxa"/>
+              <w:right w:w="120" w:type="dxa"/>
+            </w:tcMar>
+          </w:tcPr>
+          <w:p>
+            <w:pPr>
+              <w:spacing w:line="240" w:lineRule="auto" w:before="40" w:after="40"/>
+              <w:ind w:firstLine="0"/>
+              <w:jc w:val="left"/>
+            </w:pPr>
+            <w:r>
+              <w:rPr>
+                <w:rFonts w:ascii="Times New Roman" w:hAnsi="Times New Roman"/>
+                <w:b/>
+                <w:i w:val="0"/>
+                <w:sz w:val="20"/>
+              </w:rPr>
+              <w:t>Concessões e Processos Internos</w:t>
+            </w:r>
+          </w:p>
+        </w:tc>
+        <w:tc>
+          <w:tcPr>
+            <w:tcW w:type="dxa" w:w="1881"/>
+            <w:tcMar>
+              <w:top w:w="100" w:type="dxa"/>
+              <w:bottom w:w="100" w:type="dxa"/>
+              <w:left w:w="120" w:type="dxa"/>
+              <w:right w:w="120" w:type="dxa"/>
+            </w:tcMar>
+          </w:tcPr>
+          <w:p>
+            <w:pPr>
+              <w:spacing w:line="240" w:lineRule="auto" w:before="40" w:after="40"/>
+              <w:ind w:firstLine="0"/>
+              <w:jc w:val="left"/>
+            </w:pPr>
+            <w:r>
+              <w:rPr>
+                <w:rFonts w:ascii="Consolas" w:hAnsi="Consolas"/>
+                <w:color w:val="003366"/>
+                <w:sz w:val="20"/>
+              </w:rPr>
+              <w:t>concessoes</w:t>
+            </w:r>
+          </w:p>
+        </w:tc>
+        <w:tc>
+          <w:tcPr>
+            <w:tcW w:type="dxa" w:w="1881"/>
+            <w:tcMar>
+              <w:top w:w="100" w:type="dxa"/>
+              <w:bottom w:w="100" w:type="dxa"/>
+              <w:left w:w="120" w:type="dxa"/>
+              <w:right w:w="120" w:type="dxa"/>
+            </w:tcMar>
+          </w:tcPr>
+          <w:p>
+            <w:pPr>
+              <w:spacing w:line="240" w:lineRule="auto" w:before="40" w:after="40"/>
+              <w:ind w:firstLine="0"/>
+              <w:jc w:val="left"/>
+            </w:pPr>
+            <w:r>
+              <w:rPr>
+                <w:rFonts w:ascii="Times New Roman" w:hAnsi="Times New Roman"/>
+                <w:b w:val="0"/>
+                <w:i w:val="0"/>
+                <w:sz w:val="20"/>
+              </w:rPr>
+              <w:t>Lista Objetos</w:t>
+            </w:r>
+          </w:p>
+        </w:tc>
+        <w:tc>
+          <w:tcPr>
+            <w:tcW w:type="dxa" w:w="1881"/>
+            <w:tcMar>
+              <w:top w:w="100" w:type="dxa"/>
+              <w:bottom w:w="100" w:type="dxa"/>
+              <w:left w:w="120" w:type="dxa"/>
+              <w:right w:w="120" w:type="dxa"/>
+            </w:tcMar>
+          </w:tcPr>
+          <w:p>
+            <w:pPr>
+              <w:spacing w:line="240" w:lineRule="auto" w:before="40" w:after="40"/>
+              <w:ind w:firstLine="0"/>
+              <w:jc w:val="left"/>
+            </w:pPr>
+            <w:r>
+              <w:rPr>
+                <w:rFonts w:ascii="Times New Roman" w:hAnsi="Times New Roman"/>
+                <w:b w:val="0"/>
+                <w:i w:val="0"/>
+                <w:sz w:val="20"/>
+              </w:rPr>
+              <w:t>Não</w:t>
+            </w:r>
+          </w:p>
+        </w:tc>
+        <w:tc>
+          <w:tcPr>
+            <w:tcW w:type="dxa" w:w="1881"/>
+            <w:tcMar>
+              <w:top w:w="100" w:type="dxa"/>
+              <w:bottom w:w="100" w:type="dxa"/>
+              <w:left w:w="120" w:type="dxa"/>
+              <w:right w:w="120" w:type="dxa"/>
+            </w:tcMar>
+          </w:tcPr>
+          <w:p>
+            <w:pPr>
+              <w:spacing w:line="240" w:lineRule="auto" w:before="40" w:after="40"/>
+              <w:ind w:firstLine="0"/>
+              <w:jc w:val="left"/>
+            </w:pPr>
+            <w:r>
+              <w:rPr>
+                <w:rFonts w:ascii="Times New Roman" w:hAnsi="Times New Roman"/>
+                <w:b w:val="0"/>
+                <w:i w:val="0"/>
+                <w:sz w:val="20"/>
+              </w:rPr>
+              <w:t>Concessões e processos internos (manejo florestal, restauração, PROSAF, visitação etc.).</w:t>
+            </w:r>
+          </w:p>
+        </w:tc>
+      </w:tr>
+      <w:tr>
+        <w:tc>
+          <w:tcPr>
+            <w:tcW w:type="dxa" w:w="1881"/>
+            <w:tcMar>
+              <w:top w:w="100" w:type="dxa"/>
+              <w:bottom w:w="100" w:type="dxa"/>
+              <w:left w:w="120" w:type="dxa"/>
+              <w:right w:w="120" w:type="dxa"/>
+            </w:tcMar>
+          </w:tcPr>
+          <w:p>
+            <w:pPr>
+              <w:spacing w:line="240" w:lineRule="auto" w:before="40" w:after="40"/>
+              <w:ind w:firstLine="0"/>
+              <w:jc w:val="left"/>
+            </w:pPr>
+            <w:r>
+              <w:rPr>
+                <w:rFonts w:ascii="Times New Roman" w:hAnsi="Times New Roman"/>
+                <w:b/>
+                <w:i w:val="0"/>
+                <w:sz w:val="20"/>
+              </w:rPr>
+              <w:t>Estratégia Financeira</w:t>
+            </w:r>
+          </w:p>
+        </w:tc>
+        <w:tc>
+          <w:tcPr>
+            <w:tcW w:type="dxa" w:w="1881"/>
+            <w:tcMar>
+              <w:top w:w="100" w:type="dxa"/>
+              <w:bottom w:w="100" w:type="dxa"/>
+              <w:left w:w="120" w:type="dxa"/>
+              <w:right w:w="120" w:type="dxa"/>
+            </w:tcMar>
+          </w:tcPr>
+          <w:p>
+            <w:pPr>
+              <w:spacing w:line="240" w:lineRule="auto" w:before="40" w:after="40"/>
+              <w:ind w:firstLine="0"/>
+              <w:jc w:val="left"/>
+            </w:pPr>
+            <w:r>
+              <w:rPr>
+                <w:rFonts w:ascii="Consolas" w:hAnsi="Consolas"/>
+                <w:color w:val="003366"/>
+                <w:sz w:val="20"/>
+              </w:rPr>
+              <w:t>estrategia_financeira</w:t>
+            </w:r>
+          </w:p>
+        </w:tc>
+        <w:tc>
+          <w:tcPr>
+            <w:tcW w:type="dxa" w:w="1881"/>
+            <w:tcMar>
+              <w:top w:w="100" w:type="dxa"/>
+              <w:bottom w:w="100" w:type="dxa"/>
+              <w:left w:w="120" w:type="dxa"/>
+              <w:right w:w="120" w:type="dxa"/>
+            </w:tcMar>
+          </w:tcPr>
+          <w:p>
+            <w:pPr>
+              <w:spacing w:line="240" w:lineRule="auto" w:before="40" w:after="40"/>
+              <w:ind w:firstLine="0"/>
+              <w:jc w:val="left"/>
+            </w:pPr>
+            <w:r>
+              <w:rPr>
+                <w:rFonts w:ascii="Times New Roman" w:hAnsi="Times New Roman"/>
+                <w:b w:val="0"/>
+                <w:i w:val="0"/>
+                <w:sz w:val="20"/>
+              </w:rPr>
+              <w:t>Texto (Livre)</w:t>
+            </w:r>
+          </w:p>
+        </w:tc>
+        <w:tc>
+          <w:tcPr>
+            <w:tcW w:type="dxa" w:w="1881"/>
+            <w:tcMar>
+              <w:top w:w="100" w:type="dxa"/>
+              <w:bottom w:w="100" w:type="dxa"/>
+              <w:left w:w="120" w:type="dxa"/>
+              <w:right w:w="120" w:type="dxa"/>
+            </w:tcMar>
+          </w:tcPr>
+          <w:p>
+            <w:pPr>
+              <w:spacing w:line="240" w:lineRule="auto" w:before="40" w:after="40"/>
+              <w:ind w:firstLine="0"/>
+              <w:jc w:val="left"/>
+            </w:pPr>
+            <w:r>
+              <w:rPr>
+                <w:rFonts w:ascii="Times New Roman" w:hAnsi="Times New Roman"/>
+                <w:b w:val="0"/>
+                <w:i w:val="0"/>
+                <w:sz w:val="20"/>
+              </w:rPr>
+              <w:t>Não</w:t>
+            </w:r>
+          </w:p>
+        </w:tc>
+        <w:tc>
+          <w:tcPr>
+            <w:tcW w:type="dxa" w:w="1881"/>
+            <w:tcMar>
+              <w:top w:w="100" w:type="dxa"/>
+              <w:bottom w:w="100" w:type="dxa"/>
+              <w:left w:w="120" w:type="dxa"/>
+              <w:right w:w="120" w:type="dxa"/>
+            </w:tcMar>
+          </w:tcPr>
+          <w:p>
+            <w:pPr>
+              <w:spacing w:line="240" w:lineRule="auto" w:before="40" w:after="40"/>
+              <w:ind w:firstLine="0"/>
+              <w:jc w:val="left"/>
+            </w:pPr>
+            <w:r>
+              <w:rPr>
+                <w:rFonts w:ascii="Times New Roman" w:hAnsi="Times New Roman"/>
+                <w:b w:val="0"/>
+                <w:i w:val="0"/>
+                <w:sz w:val="20"/>
+              </w:rPr>
+              <w:t>Resumo da estratégia financeira da UC (arts. 69-73 da Lei 10.306/2023).</w:t>
+            </w:r>
+          </w:p>
+        </w:tc>
+      </w:tr>
+      <w:tr>
+        <w:tc>
+          <w:tcPr>
+            <w:tcW w:type="dxa" w:w="1881"/>
+            <w:tcMar>
+              <w:top w:w="100" w:type="dxa"/>
+              <w:bottom w:w="100" w:type="dxa"/>
+              <w:left w:w="120" w:type="dxa"/>
+              <w:right w:w="120" w:type="dxa"/>
+            </w:tcMar>
+          </w:tcPr>
+          <w:p>
+            <w:pPr>
+              <w:spacing w:line="240" w:lineRule="auto" w:before="40" w:after="40"/>
+              <w:ind w:firstLine="0"/>
+              <w:jc w:val="left"/>
+            </w:pPr>
+            <w:r>
+              <w:rPr>
+                <w:rFonts w:ascii="Times New Roman" w:hAnsi="Times New Roman"/>
+                <w:b/>
+                <w:i w:val="0"/>
+                <w:sz w:val="20"/>
+              </w:rPr>
+              <w:t>Recursos Disponíveis (R$)</w:t>
+            </w:r>
+          </w:p>
+        </w:tc>
+        <w:tc>
+          <w:tcPr>
+            <w:tcW w:type="dxa" w:w="1881"/>
+            <w:tcMar>
+              <w:top w:w="100" w:type="dxa"/>
+              <w:bottom w:w="100" w:type="dxa"/>
+              <w:left w:w="120" w:type="dxa"/>
+              <w:right w:w="120" w:type="dxa"/>
+            </w:tcMar>
+          </w:tcPr>
+          <w:p>
+            <w:pPr>
+              <w:spacing w:line="240" w:lineRule="auto" w:before="40" w:after="40"/>
+              <w:ind w:firstLine="0"/>
+              <w:jc w:val="left"/>
+            </w:pPr>
+            <w:r>
+              <w:rPr>
+                <w:rFonts w:ascii="Consolas" w:hAnsi="Consolas"/>
+                <w:color w:val="003366"/>
+                <w:sz w:val="20"/>
+              </w:rPr>
+              <w:t>recursos_disponiveis_brl</w:t>
+            </w:r>
+          </w:p>
+        </w:tc>
+        <w:tc>
+          <w:tcPr>
+            <w:tcW w:type="dxa" w:w="1881"/>
+            <w:tcMar>
+              <w:top w:w="100" w:type="dxa"/>
+              <w:bottom w:w="100" w:type="dxa"/>
+              <w:left w:w="120" w:type="dxa"/>
+              <w:right w:w="120" w:type="dxa"/>
+            </w:tcMar>
+          </w:tcPr>
+          <w:p>
+            <w:pPr>
+              <w:spacing w:line="240" w:lineRule="auto" w:before="40" w:after="40"/>
+              <w:ind w:firstLine="0"/>
+              <w:jc w:val="left"/>
+            </w:pPr>
+            <w:r>
+              <w:rPr>
+                <w:rFonts w:ascii="Times New Roman" w:hAnsi="Times New Roman"/>
+                <w:b w:val="0"/>
+                <w:i w:val="0"/>
+                <w:sz w:val="20"/>
+              </w:rPr>
+              <w:t>Número (Decimal)</w:t>
+            </w:r>
+          </w:p>
+        </w:tc>
+        <w:tc>
+          <w:tcPr>
+            <w:tcW w:type="dxa" w:w="1881"/>
+            <w:tcMar>
+              <w:top w:w="100" w:type="dxa"/>
+              <w:bottom w:w="100" w:type="dxa"/>
+              <w:left w:w="120" w:type="dxa"/>
+              <w:right w:w="120" w:type="dxa"/>
+            </w:tcMar>
+          </w:tcPr>
+          <w:p>
+            <w:pPr>
+              <w:spacing w:line="240" w:lineRule="auto" w:before="40" w:after="40"/>
+              <w:ind w:firstLine="0"/>
+              <w:jc w:val="left"/>
+            </w:pPr>
+            <w:r>
+              <w:rPr>
+                <w:rFonts w:ascii="Times New Roman" w:hAnsi="Times New Roman"/>
+                <w:b w:val="0"/>
+                <w:i w:val="0"/>
+                <w:sz w:val="20"/>
+              </w:rPr>
+              <w:t>Não</w:t>
+            </w:r>
+          </w:p>
+        </w:tc>
+        <w:tc>
+          <w:tcPr>
+            <w:tcW w:type="dxa" w:w="1881"/>
+            <w:tcMar>
+              <w:top w:w="100" w:type="dxa"/>
+              <w:bottom w:w="100" w:type="dxa"/>
+              <w:left w:w="120" w:type="dxa"/>
+              <w:right w:w="120" w:type="dxa"/>
+            </w:tcMar>
+          </w:tcPr>
+          <w:p>
+            <w:pPr>
+              <w:spacing w:line="240" w:lineRule="auto" w:before="40" w:after="40"/>
+              <w:ind w:firstLine="0"/>
+              <w:jc w:val="left"/>
+            </w:pPr>
+            <w:r>
+              <w:rPr>
+                <w:rFonts w:ascii="Times New Roman" w:hAnsi="Times New Roman"/>
+                <w:b w:val="0"/>
+                <w:i w:val="0"/>
+                <w:sz w:val="20"/>
+              </w:rPr>
+              <w:t>Recursos financeiros disponíveis para a UC (nível técnico).</w:t>
+            </w:r>
+          </w:p>
+        </w:tc>
+      </w:tr>
+      <w:tr>
+        <w:tc>
+          <w:tcPr>
+            <w:tcW w:type="dxa" w:w="1881"/>
+            <w:tcMar>
+              <w:top w:w="100" w:type="dxa"/>
+              <w:bottom w:w="100" w:type="dxa"/>
+              <w:left w:w="120" w:type="dxa"/>
+              <w:right w:w="120" w:type="dxa"/>
+            </w:tcMar>
+          </w:tcPr>
+          <w:p>
+            <w:pPr>
+              <w:spacing w:line="240" w:lineRule="auto" w:before="40" w:after="40"/>
+              <w:ind w:firstLine="0"/>
+              <w:jc w:val="left"/>
+            </w:pPr>
+            <w:r>
+              <w:rPr>
+                <w:rFonts w:ascii="Times New Roman" w:hAnsi="Times New Roman"/>
+                <w:b/>
+                <w:i w:val="0"/>
+                <w:sz w:val="20"/>
+              </w:rPr>
+              <w:t>Plano de Aplicação aprovado na CCA</w:t>
+            </w:r>
+          </w:p>
+        </w:tc>
+        <w:tc>
+          <w:tcPr>
+            <w:tcW w:type="dxa" w:w="1881"/>
+            <w:tcMar>
+              <w:top w:w="100" w:type="dxa"/>
+              <w:bottom w:w="100" w:type="dxa"/>
+              <w:left w:w="120" w:type="dxa"/>
+              <w:right w:w="120" w:type="dxa"/>
+            </w:tcMar>
+          </w:tcPr>
+          <w:p>
+            <w:pPr>
+              <w:spacing w:line="240" w:lineRule="auto" w:before="40" w:after="40"/>
+              <w:ind w:firstLine="0"/>
+              <w:jc w:val="left"/>
+            </w:pPr>
+            <w:r>
+              <w:rPr>
+                <w:rFonts w:ascii="Consolas" w:hAnsi="Consolas"/>
+                <w:color w:val="003366"/>
+                <w:sz w:val="20"/>
+              </w:rPr>
+              <w:t>plano_aplicacao_cca</w:t>
+            </w:r>
+          </w:p>
+        </w:tc>
+        <w:tc>
+          <w:tcPr>
+            <w:tcW w:type="dxa" w:w="1881"/>
+            <w:tcMar>
+              <w:top w:w="100" w:type="dxa"/>
+              <w:bottom w:w="100" w:type="dxa"/>
+              <w:left w:w="120" w:type="dxa"/>
+              <w:right w:w="120" w:type="dxa"/>
+            </w:tcMar>
+          </w:tcPr>
+          <w:p>
+            <w:pPr>
+              <w:spacing w:line="240" w:lineRule="auto" w:before="40" w:after="40"/>
+              <w:ind w:firstLine="0"/>
+              <w:jc w:val="left"/>
+            </w:pPr>
+            <w:r>
+              <w:rPr>
+                <w:rFonts w:ascii="Times New Roman" w:hAnsi="Times New Roman"/>
+                <w:b w:val="0"/>
+                <w:i w:val="0"/>
+                <w:sz w:val="20"/>
+              </w:rPr>
+              <w:t>Texto (Livre)</w:t>
+            </w:r>
+          </w:p>
+        </w:tc>
+        <w:tc>
+          <w:tcPr>
+            <w:tcW w:type="dxa" w:w="1881"/>
+            <w:tcMar>
+              <w:top w:w="100" w:type="dxa"/>
+              <w:bottom w:w="100" w:type="dxa"/>
+              <w:left w:w="120" w:type="dxa"/>
+              <w:right w:w="120" w:type="dxa"/>
+            </w:tcMar>
+          </w:tcPr>
+          <w:p>
+            <w:pPr>
+              <w:spacing w:line="240" w:lineRule="auto" w:before="40" w:after="40"/>
+              <w:ind w:firstLine="0"/>
+              <w:jc w:val="left"/>
+            </w:pPr>
+            <w:r>
+              <w:rPr>
+                <w:rFonts w:ascii="Times New Roman" w:hAnsi="Times New Roman"/>
+                <w:b w:val="0"/>
+                <w:i w:val="0"/>
+                <w:sz w:val="20"/>
+              </w:rPr>
+              <w:t>Não</w:t>
+            </w:r>
+          </w:p>
+        </w:tc>
+        <w:tc>
+          <w:tcPr>
+            <w:tcW w:type="dxa" w:w="1881"/>
+            <w:tcMar>
+              <w:top w:w="100" w:type="dxa"/>
+              <w:bottom w:w="100" w:type="dxa"/>
+              <w:left w:w="120" w:type="dxa"/>
+              <w:right w:w="120" w:type="dxa"/>
+            </w:tcMar>
+          </w:tcPr>
+          <w:p>
+            <w:pPr>
+              <w:spacing w:line="240" w:lineRule="auto" w:before="40" w:after="40"/>
+              <w:ind w:firstLine="0"/>
+              <w:jc w:val="left"/>
+            </w:pPr>
+            <w:r>
+              <w:rPr>
+                <w:rFonts w:ascii="Times New Roman" w:hAnsi="Times New Roman"/>
+                <w:b w:val="0"/>
+                <w:i w:val="0"/>
+                <w:sz w:val="20"/>
+              </w:rPr>
+              <w:t>Planos de aplicação de recursos aprovados na Câmara de Compensação Ambiental (CCA).</w:t>
+            </w:r>
+          </w:p>
+        </w:tc>
+      </w:tr>
     </w:tbl>
     <w:p>
       <w:pPr>
@@ -8258,7 +11515,123 @@
               <w:br/>
               <w:t xml:space="preserve">    "visitantes_qtd": { "type": "integer", "minimum": 0 },</w:t>
               <w:br/>
-              <w:t xml:space="preserve">    "receita_arrecadada_brl": { "type": "number", "minimum": 0 }</w:t>
+              <w:t xml:space="preserve">    "receita_arrecadada_brl": { "type": "number", "minimum": 0 },</w:t>
+              <w:br/>
+              <w:t xml:space="preserve">    "gestor_responsavel_nome": { "type": "string" },</w:t>
+              <w:br/>
+              <w:t xml:space="preserve">    "gestor_responsavel_cargo": { "type": "string" },</w:t>
+              <w:br/>
+              <w:t xml:space="preserve">    "gestor_contato_email": { "type": "string", "format": "email" },</w:t>
+              <w:br/>
+              <w:t xml:space="preserve">    "gestor_nomeacao_ato": { "type": "string" },</w:t>
+              <w:br/>
+              <w:t xml:space="preserve">    "conselho_composicao": {</w:t>
+              <w:br/>
+              <w:t xml:space="preserve">      "type": "array",</w:t>
+              <w:br/>
+              <w:t xml:space="preserve">      "items": {</w:t>
+              <w:br/>
+              <w:t xml:space="preserve">        "type": "object",</w:t>
+              <w:br/>
+              <w:t xml:space="preserve">        "properties": {</w:t>
+              <w:br/>
+              <w:t xml:space="preserve">          "nome_completo": { "type": "string" },</w:t>
+              <w:br/>
+              <w:t xml:space="preserve">          "segmento": { "type": "string" },</w:t>
+              <w:br/>
+              <w:t xml:space="preserve">          "mandato_inicio": { "type": "string", "format": "date" },</w:t>
+              <w:br/>
+              <w:t xml:space="preserve">          "mandato_fim": { "type": "string", "format": "date" }</w:t>
+              <w:br/>
+              <w:t xml:space="preserve">        }</w:t>
+              <w:br/>
+              <w:t xml:space="preserve">      }</w:t>
+              <w:br/>
+              <w:t xml:space="preserve">    },</w:t>
+              <w:br/>
+              <w:t xml:space="preserve">    "plano_gestao_versao": { "type": "string" },</w:t>
+              <w:br/>
+              <w:t xml:space="preserve">    "plano_gestao_atualizacoes": { "type": "string" },</w:t>
+              <w:br/>
+              <w:t xml:space="preserve">    "projetos": {</w:t>
+              <w:br/>
+              <w:t xml:space="preserve">      "type": "array",</w:t>
+              <w:br/>
+              <w:t xml:space="preserve">      "items": {</w:t>
+              <w:br/>
+              <w:t xml:space="preserve">        "type": "object",</w:t>
+              <w:br/>
+              <w:t xml:space="preserve">        "properties": {</w:t>
+              <w:br/>
+              <w:t xml:space="preserve">          "nome": { "type": "string" },</w:t>
+              <w:br/>
+              <w:t xml:space="preserve">          "tipo": { "type": "string" },</w:t>
+              <w:br/>
+              <w:t xml:space="preserve">          "status": { "type": "string" },</w:t>
+              <w:br/>
+              <w:t xml:space="preserve">          "parceiro": { "type": "string" },</w:t>
+              <w:br/>
+              <w:t xml:space="preserve">          "vigencia_inicio": { "type": "string", "format": "date" },</w:t>
+              <w:br/>
+              <w:t xml:space="preserve">          "vigencia_fim": { "type": "string", "format": "date" }</w:t>
+              <w:br/>
+              <w:t xml:space="preserve">        }</w:t>
+              <w:br/>
+              <w:t xml:space="preserve">      }</w:t>
+              <w:br/>
+              <w:t xml:space="preserve">    },</w:t>
+              <w:br/>
+              <w:t xml:space="preserve">    "cooperacoes": {</w:t>
+              <w:br/>
+              <w:t xml:space="preserve">      "type": "array",</w:t>
+              <w:br/>
+              <w:t xml:space="preserve">      "items": {</w:t>
+              <w:br/>
+              <w:t xml:space="preserve">        "type": "object",</w:t>
+              <w:br/>
+              <w:t xml:space="preserve">        "properties": {</w:t>
+              <w:br/>
+              <w:t xml:space="preserve">          "tipo": { "type": "string" },</w:t>
+              <w:br/>
+              <w:t xml:space="preserve">          "objeto": { "type": "string" },</w:t>
+              <w:br/>
+              <w:t xml:space="preserve">          "parceiro": { "type": "string" },</w:t>
+              <w:br/>
+              <w:t xml:space="preserve">          "vigencia_fim": { "type": "string", "format": "date" }</w:t>
+              <w:br/>
+              <w:t xml:space="preserve">        }</w:t>
+              <w:br/>
+              <w:t xml:space="preserve">      }</w:t>
+              <w:br/>
+              <w:t xml:space="preserve">    },</w:t>
+              <w:br/>
+              <w:t xml:space="preserve">    "concessoes": {</w:t>
+              <w:br/>
+              <w:t xml:space="preserve">      "type": "array",</w:t>
+              <w:br/>
+              <w:t xml:space="preserve">      "items": {</w:t>
+              <w:br/>
+              <w:t xml:space="preserve">        "type": "object",</w:t>
+              <w:br/>
+              <w:t xml:space="preserve">        "properties": {</w:t>
+              <w:br/>
+              <w:t xml:space="preserve">          "tipo": { "type": "string" },</w:t>
+              <w:br/>
+              <w:t xml:space="preserve">          "objeto": { "type": "string" },</w:t>
+              <w:br/>
+              <w:t xml:space="preserve">          "vigencia_fim": { "type": "string", "format": "date" }</w:t>
+              <w:br/>
+              <w:t xml:space="preserve">        }</w:t>
+              <w:br/>
+              <w:t xml:space="preserve">      }</w:t>
+              <w:br/>
+              <w:t xml:space="preserve">    },</w:t>
+              <w:br/>
+              <w:t xml:space="preserve">    "estrategia_financeira": { "type": "string" },</w:t>
+              <w:br/>
+              <w:t xml:space="preserve">    "recursos_disponiveis_brl": { "type": "number", "minimum": 0 },</w:t>
+              <w:br/>
+              <w:t xml:space="preserve">    "plano_aplicacao_cca": { "type": "string" }</w:t>
               <w:br/>
               <w:t xml:space="preserve">  },</w:t>
               <w:br/>

</xml_diff>